<commit_message>
Cotizaciones: paleta sin saturar y todo en una hoja
El formato pasa de dos hojas a una, y las tintas bajan de tono para que la
unica saturada de la pagina sea la del propio logotipo.

- Grafito #23272B en lugar de negro puro y vino #8A3B33 en lugar del rojo de
  marca. La banda del total va en vino oscuro y el encabezado de la tabla en
  grafito.
- Los grises de filetes y bandas se van al calido para acompanar al vino.
- Los nueve datos del embarque se acomodan en una reticula de tres por tres.
- Las consideraciones bajan a letra chica en dos columnas: a lo ancho de la
  hoja la linea era imposible de leer.
- Firmas en una sola linea bajo cada raya, y el pie con las direcciones en dos
  renglones por plaza.

La hoja queda con unos dos renglones de holgura, anotado en el README junto con
que hacer si una cotizacion no alcanza a caber.

Co-Authored-By: Claude Opus 5 <noreply@anthropic.com>
Claude-Session: https://claude.ai/code/session_01LpUxEq15ebuz4AEpF8P5XY
</commit_message>
<xml_diff>
--- a/formatos/cotizacion/COTIZACION_FLETES_TAURO_2026.docx
+++ b/formatos/cotizacion/COTIZACION_FLETES_TAURO_2026.docx
@@ -4,7 +4,7 @@
   <w:body>
     <w:tbl>
       <w:tblPr>
-        <w:tblW w:type="dxa" w:w="9072"/>
+        <w:tblW w:type="dxa" w:w="9504"/>
         <w:tblBorders>
           <w:top w:val="none"/>
           <w:left w:val="none"/>
@@ -16,13 +16,13 @@
         <w:tblLayout w:type="fixed"/>
       </w:tblPr>
       <w:tblGrid>
-        <w:gridCol w:w="4200"/>
-        <w:gridCol w:w="4872"/>
+        <w:gridCol w:w="4400"/>
+        <w:gridCol w:w="5104"/>
       </w:tblGrid>
       <w:tr>
         <w:tc>
           <w:tcPr>
-            <w:tcW w:type="dxa" w:w="4200"/>
+            <w:tcW w:type="dxa" w:w="4400"/>
             <w:tcMar>
               <w:top w:type="dxa" w:w="0"/>
               <w:left w:type="dxa" w:w="0"/>
@@ -37,7 +37,7 @@
             <w:r>
               <w:drawing>
                 <wp:inline distT="0" distB="0" distL="0" distR="0">
-                  <wp:extent cx="1333500" cy="904875"/>
+                  <wp:extent cx="1123950" cy="762000"/>
                   <wp:effectExtent t="0" r="0" b="0" l="0"/>
                   <wp:docPr id="1" name="" descr="" title=""/>
                   <wp:cNvGraphicFramePr>
@@ -62,7 +62,7 @@
                         <pic:spPr bwMode="auto">
                           <a:xfrm>
                             <a:off x="0" y="0"/>
-                            <a:ext cx="1333500" cy="904875"/>
+                            <a:ext cx="1123950" cy="762000"/>
                           </a:xfrm>
                           <a:prstGeom prst="rect">
                             <a:avLst/>
@@ -78,18 +78,18 @@
         </w:tc>
         <w:tc>
           <w:tcPr>
-            <w:tcW w:type="dxa" w:w="4872"/>
+            <w:tcW w:type="dxa" w:w="5104"/>
             <w:tcMar>
               <w:top w:type="dxa" w:w="0"/>
               <w:left w:type="dxa" w:w="0"/>
-              <w:bottom w:type="dxa" w:w="40"/>
+              <w:bottom w:type="dxa" w:w="30"/>
               <w:right w:type="dxa" w:w="0"/>
             </w:tcMar>
             <w:vAlign w:val="bottom"/>
           </w:tcPr>
           <w:p>
             <w:pPr>
-              <w:spacing w:after="80" w:before="0"/>
+              <w:spacing w:after="70" w:before="0"/>
               <w:jc w:val="right"/>
             </w:pPr>
             <w:r>
@@ -97,12 +97,10 @@
                 <w:rFonts w:ascii="Cambria" w:cs="Cambria" w:eastAsia="Cambria" w:hAnsi="Cambria"/>
                 <w:b w:val="false"/>
                 <w:bCs w:val="false"/>
-                <w:i w:val="false"/>
-                <w:iCs w:val="false"/>
-                <w:color w:val="0E0F11"/>
-                <w:spacing w:val="120"/>
-                <w:sz w:val="44"/>
-                <w:szCs w:val="44"/>
+                <w:color w:val="23272B"/>
+                <w:spacing w:val="110"/>
+                <w:sz w:val="36"/>
+                <w:szCs w:val="36"/>
               </w:rPr>
               <w:t xml:space="preserve">COTIZACIÓN</w:t>
             </w:r>
@@ -117,12 +115,10 @@
                 <w:rFonts w:ascii="Calibri" w:cs="Calibri" w:eastAsia="Calibri" w:hAnsi="Calibri"/>
                 <w:b/>
                 <w:bCs/>
-                <w:i w:val="false"/>
-                <w:iCs w:val="false"/>
-                <w:color w:val="7C818A"/>
+                <w:color w:val="767369"/>
                 <w:spacing w:val="90"/>
-                <w:sz w:val="13"/>
-                <w:szCs w:val="13"/>
+                <w:sz w:val="12"/>
+                <w:szCs w:val="12"/>
               </w:rPr>
               <w:t xml:space="preserve">DE SERVICIO DE TRANSPORTE</w:t>
             </w:r>
@@ -139,9 +135,7 @@
           <w:rFonts w:ascii="Calibri" w:cs="Calibri" w:eastAsia="Calibri" w:hAnsi="Calibri"/>
           <w:b w:val="false"/>
           <w:bCs w:val="false"/>
-          <w:i w:val="false"/>
-          <w:iCs w:val="false"/>
-          <w:color w:val="42464B"/>
+          <w:color w:val="4F545A"/>
           <w:sz w:val="6"/>
           <w:szCs w:val="6"/>
         </w:rPr>
@@ -150,7 +144,7 @@
     </w:p>
     <w:tbl>
       <w:tblPr>
-        <w:tblW w:type="dxa" w:w="9072"/>
+        <w:tblW w:type="dxa" w:w="9504"/>
         <w:tblBorders>
           <w:top w:val="none"/>
           <w:left w:val="none"/>
@@ -162,17 +156,17 @@
         <w:tblLayout w:type="fixed"/>
       </w:tblPr>
       <w:tblGrid>
-        <w:gridCol w:w="1240"/>
-        <w:gridCol w:w="7832"/>
+        <w:gridCol w:w="1160"/>
+        <w:gridCol w:w="8344"/>
       </w:tblGrid>
       <w:tr>
         <w:tc>
           <w:tcPr>
-            <w:tcW w:type="dxa" w:w="1240"/>
+            <w:tcW w:type="dxa" w:w="1160"/>
             <w:tcBorders>
               <w:top w:val="none"/>
               <w:left w:val="none"/>
-              <w:bottom w:val="single" w:color="C21112" w:sz="20"/>
+              <w:bottom w:val="single" w:color="8A3B33" w:sz="16"/>
               <w:right w:val="none"/>
             </w:tcBorders>
             <w:tcMar>
@@ -191,9 +185,7 @@
                 <w:rFonts w:ascii="Calibri" w:cs="Calibri" w:eastAsia="Calibri" w:hAnsi="Calibri"/>
                 <w:b w:val="false"/>
                 <w:bCs w:val="false"/>
-                <w:i w:val="false"/>
-                <w:iCs w:val="false"/>
-                <w:color w:val="42464B"/>
+                <w:color w:val="4F545A"/>
                 <w:sz w:val="1"/>
                 <w:szCs w:val="1"/>
               </w:rPr>
@@ -203,11 +195,11 @@
         </w:tc>
         <w:tc>
           <w:tcPr>
-            <w:tcW w:type="dxa" w:w="7832"/>
+            <w:tcW w:type="dxa" w:w="8344"/>
             <w:tcBorders>
               <w:top w:val="none"/>
               <w:left w:val="none"/>
-              <w:bottom w:val="single" w:color="D6D3CE" w:sz="4"/>
+              <w:bottom w:val="single" w:color="D9D3C9" w:sz="4"/>
               <w:right w:val="none"/>
             </w:tcBorders>
             <w:tcMar>
@@ -226,9 +218,7 @@
                 <w:rFonts w:ascii="Calibri" w:cs="Calibri" w:eastAsia="Calibri" w:hAnsi="Calibri"/>
                 <w:b w:val="false"/>
                 <w:bCs w:val="false"/>
-                <w:i w:val="false"/>
-                <w:iCs w:val="false"/>
-                <w:color w:val="42464B"/>
+                <w:color w:val="4F545A"/>
                 <w:sz w:val="1"/>
                 <w:szCs w:val="1"/>
               </w:rPr>
@@ -247,35 +237,30 @@
           <w:rFonts w:ascii="Calibri" w:cs="Calibri" w:eastAsia="Calibri" w:hAnsi="Calibri"/>
           <w:b w:val="false"/>
           <w:bCs w:val="false"/>
-          <w:i w:val="false"/>
-          <w:iCs w:val="false"/>
-          <w:color w:val="42464B"/>
-          <w:sz w:val="4"/>
-          <w:szCs w:val="4"/>
+          <w:color w:val="4F545A"/>
+          <w:sz w:val="6"/>
+          <w:szCs w:val="6"/>
         </w:rPr>
         <w:t xml:space="preserve"/>
       </w:r>
     </w:p>
     <w:tbl>
       <w:tblPr>
-        <w:tblW w:type="dxa" w:w="9072"/>
+        <w:tblW w:type="dxa" w:w="9504"/>
         <w:tblBorders>
-          <w:top w:val="single" w:color="E9E6E1" w:sz="4"/>
+          <w:top w:val="single" w:color="EBE7E0" w:sz="4"/>
           <w:left w:val="none"/>
-          <w:bottom w:val="single" w:color="E9E6E1" w:sz="4"/>
+          <w:bottom w:val="single" w:color="EBE7E0" w:sz="4"/>
           <w:right w:val="none"/>
-          <w:insideH w:val="single" w:color="E9E6E1" w:sz="4"/>
+          <w:insideH w:val="single" w:color="EBE7E0" w:sz="4"/>
           <w:insideV w:val="none"/>
         </w:tblBorders>
         <w:tblLayout w:type="fixed"/>
       </w:tblPr>
       <w:tblGrid>
-        <w:gridCol w:w="1512"/>
-        <w:gridCol w:w="1512"/>
-        <w:gridCol w:w="1512"/>
-        <w:gridCol w:w="1512"/>
-        <w:gridCol w:w="1512"/>
-        <w:gridCol w:w="1512"/>
+        <w:gridCol w:w="3168"/>
+        <w:gridCol w:w="3168"/>
+        <w:gridCol w:w="3168"/>
       </w:tblGrid>
       <w:tr>
         <w:trPr>
@@ -283,30 +268,27 @@
         </w:trPr>
         <w:tc>
           <w:tcPr>
-            <w:tcW w:type="dxa" w:w="3024"/>
-            <w:gridSpan w:val="2"/>
-            <w:tcMar>
-              <w:top w:type="dxa" w:w="95"/>
+            <w:tcW w:type="dxa" w:w="3168"/>
+            <w:tcMar>
+              <w:top w:type="dxa" w:w="56"/>
               <w:left w:type="dxa" w:w="0"/>
-              <w:bottom w:type="dxa" w:w="95"/>
-              <w:right w:type="dxa" w:w="200"/>
-            </w:tcMar>
-          </w:tcPr>
-          <w:p>
-            <w:pPr>
-              <w:spacing w:after="40" w:before="0"/>
+              <w:bottom w:type="dxa" w:w="56"/>
+              <w:right w:type="dxa" w:w="240"/>
+            </w:tcMar>
+          </w:tcPr>
+          <w:p>
+            <w:pPr>
+              <w:spacing w:after="30" w:before="0"/>
             </w:pPr>
             <w:r>
               <w:rPr>
                 <w:rFonts w:ascii="Calibri" w:cs="Calibri" w:eastAsia="Calibri" w:hAnsi="Calibri"/>
                 <w:b/>
                 <w:bCs/>
-                <w:i w:val="false"/>
-                <w:iCs w:val="false"/>
-                <w:color w:val="7C818A"/>
+                <w:color w:val="767369"/>
                 <w:spacing w:val="70"/>
-                <w:sz w:val="13"/>
-                <w:szCs w:val="13"/>
+                <w:sz w:val="12"/>
+                <w:szCs w:val="12"/>
               </w:rPr>
               <w:t xml:space="preserve">FOLIO</w:t>
             </w:r>
@@ -320,11 +302,9 @@
                 <w:rFonts w:ascii="Cambria" w:cs="Cambria" w:eastAsia="Cambria" w:hAnsi="Cambria"/>
                 <w:b w:val="false"/>
                 <w:bCs w:val="false"/>
-                <w:i w:val="false"/>
-                <w:iCs w:val="false"/>
-                <w:color w:val="0E0F11"/>
-                <w:sz w:val="21"/>
-                <w:szCs w:val="21"/>
+                <w:color w:val="23272B"/>
+                <w:sz w:val="19"/>
+                <w:szCs w:val="19"/>
               </w:rPr>
               <w:t xml:space="preserve">COT-2026-0001</w:t>
             </w:r>
@@ -332,30 +312,27 @@
         </w:tc>
         <w:tc>
           <w:tcPr>
-            <w:tcW w:type="dxa" w:w="3024"/>
-            <w:gridSpan w:val="2"/>
-            <w:tcMar>
-              <w:top w:type="dxa" w:w="95"/>
+            <w:tcW w:type="dxa" w:w="3168"/>
+            <w:tcMar>
+              <w:top w:type="dxa" w:w="56"/>
               <w:left w:type="dxa" w:w="0"/>
-              <w:bottom w:type="dxa" w:w="95"/>
-              <w:right w:type="dxa" w:w="200"/>
-            </w:tcMar>
-          </w:tcPr>
-          <w:p>
-            <w:pPr>
-              <w:spacing w:after="40" w:before="0"/>
+              <w:bottom w:type="dxa" w:w="56"/>
+              <w:right w:type="dxa" w:w="240"/>
+            </w:tcMar>
+          </w:tcPr>
+          <w:p>
+            <w:pPr>
+              <w:spacing w:after="30" w:before="0"/>
             </w:pPr>
             <w:r>
               <w:rPr>
                 <w:rFonts w:ascii="Calibri" w:cs="Calibri" w:eastAsia="Calibri" w:hAnsi="Calibri"/>
                 <w:b/>
                 <w:bCs/>
-                <w:i w:val="false"/>
-                <w:iCs w:val="false"/>
-                <w:color w:val="7C818A"/>
+                <w:color w:val="767369"/>
                 <w:spacing w:val="70"/>
-                <w:sz w:val="13"/>
-                <w:szCs w:val="13"/>
+                <w:sz w:val="12"/>
+                <w:szCs w:val="12"/>
               </w:rPr>
               <w:t xml:space="preserve">FECHA</w:t>
             </w:r>
@@ -369,11 +346,9 @@
                 <w:rFonts w:ascii="Calibri" w:cs="Calibri" w:eastAsia="Calibri" w:hAnsi="Calibri"/>
                 <w:b w:val="false"/>
                 <w:bCs w:val="false"/>
-                <w:i w:val="false"/>
-                <w:iCs w:val="false"/>
-                <w:color w:val="0E0F11"/>
-                <w:sz w:val="21"/>
-                <w:szCs w:val="21"/>
+                <w:color w:val="23272B"/>
+                <w:sz w:val="19"/>
+                <w:szCs w:val="19"/>
               </w:rPr>
               <w:t xml:space="preserve">10 de agosto de 2026</w:t>
             </w:r>
@@ -381,30 +356,27 @@
         </w:tc>
         <w:tc>
           <w:tcPr>
-            <w:tcW w:type="dxa" w:w="3024"/>
-            <w:gridSpan w:val="2"/>
-            <w:tcMar>
-              <w:top w:type="dxa" w:w="95"/>
+            <w:tcW w:type="dxa" w:w="3168"/>
+            <w:tcMar>
+              <w:top w:type="dxa" w:w="56"/>
               <w:left w:type="dxa" w:w="0"/>
-              <w:bottom w:type="dxa" w:w="95"/>
+              <w:bottom w:type="dxa" w:w="56"/>
               <w:right w:type="dxa" w:w="0"/>
             </w:tcMar>
           </w:tcPr>
           <w:p>
             <w:pPr>
-              <w:spacing w:after="40" w:before="0"/>
+              <w:spacing w:after="30" w:before="0"/>
             </w:pPr>
             <w:r>
               <w:rPr>
                 <w:rFonts w:ascii="Calibri" w:cs="Calibri" w:eastAsia="Calibri" w:hAnsi="Calibri"/>
                 <w:b/>
                 <w:bCs/>
-                <w:i w:val="false"/>
-                <w:iCs w:val="false"/>
-                <w:color w:val="7C818A"/>
+                <w:color w:val="767369"/>
                 <w:spacing w:val="70"/>
-                <w:sz w:val="13"/>
-                <w:szCs w:val="13"/>
+                <w:sz w:val="12"/>
+                <w:szCs w:val="12"/>
               </w:rPr>
               <w:t xml:space="preserve">VIGENCIA</w:t>
             </w:r>
@@ -418,11 +390,9 @@
                 <w:rFonts w:ascii="Calibri" w:cs="Calibri" w:eastAsia="Calibri" w:hAnsi="Calibri"/>
                 <w:b w:val="false"/>
                 <w:bCs w:val="false"/>
-                <w:i w:val="false"/>
-                <w:iCs w:val="false"/>
-                <w:color w:val="0E0F11"/>
-                <w:sz w:val="21"/>
-                <w:szCs w:val="21"/>
+                <w:color w:val="23272B"/>
+                <w:sz w:val="19"/>
+                <w:szCs w:val="19"/>
               </w:rPr>
               <w:t xml:space="preserve">15 días naturales</w:t>
             </w:r>
@@ -435,30 +405,27 @@
         </w:trPr>
         <w:tc>
           <w:tcPr>
-            <w:tcW w:type="dxa" w:w="4536"/>
-            <w:gridSpan w:val="3"/>
-            <w:tcMar>
-              <w:top w:type="dxa" w:w="95"/>
+            <w:tcW w:type="dxa" w:w="3168"/>
+            <w:tcMar>
+              <w:top w:type="dxa" w:w="56"/>
               <w:left w:type="dxa" w:w="0"/>
-              <w:bottom w:type="dxa" w:w="95"/>
-              <w:right w:type="dxa" w:w="280"/>
-            </w:tcMar>
-          </w:tcPr>
-          <w:p>
-            <w:pPr>
-              <w:spacing w:after="40" w:before="0"/>
+              <w:bottom w:type="dxa" w:w="56"/>
+              <w:right w:type="dxa" w:w="240"/>
+            </w:tcMar>
+          </w:tcPr>
+          <w:p>
+            <w:pPr>
+              <w:spacing w:after="30" w:before="0"/>
             </w:pPr>
             <w:r>
               <w:rPr>
                 <w:rFonts w:ascii="Calibri" w:cs="Calibri" w:eastAsia="Calibri" w:hAnsi="Calibri"/>
                 <w:b/>
                 <w:bCs/>
-                <w:i w:val="false"/>
-                <w:iCs w:val="false"/>
-                <w:color w:val="7C818A"/>
+                <w:color w:val="767369"/>
                 <w:spacing w:val="70"/>
-                <w:sz w:val="13"/>
-                <w:szCs w:val="13"/>
+                <w:sz w:val="12"/>
+                <w:szCs w:val="12"/>
               </w:rPr>
               <w:t xml:space="preserve">CLIENTE</w:t>
             </w:r>
@@ -472,62 +439,99 @@
                 <w:rFonts w:ascii="Calibri" w:cs="Calibri" w:eastAsia="Calibri" w:hAnsi="Calibri"/>
                 <w:b w:val="false"/>
                 <w:bCs w:val="false"/>
-                <w:i w:val="false"/>
-                <w:iCs w:val="false"/>
-                <w:color w:val="A9A29A"/>
-                <w:sz w:val="21"/>
-                <w:szCs w:val="21"/>
-              </w:rPr>
-              <w:t xml:space="preserve">[ Razón social del cliente ]</w:t>
-            </w:r>
-          </w:p>
-        </w:tc>
-        <w:tc>
-          <w:tcPr>
-            <w:tcW w:type="dxa" w:w="4536"/>
-            <w:gridSpan w:val="3"/>
-            <w:tcMar>
-              <w:top w:type="dxa" w:w="95"/>
+                <w:color w:val="95908A"/>
+                <w:sz w:val="19"/>
+                <w:szCs w:val="19"/>
+              </w:rPr>
+              <w:t xml:space="preserve">[ Razón social ]</w:t>
+            </w:r>
+          </w:p>
+        </w:tc>
+        <w:tc>
+          <w:tcPr>
+            <w:tcW w:type="dxa" w:w="3168"/>
+            <w:tcMar>
+              <w:top w:type="dxa" w:w="56"/>
               <w:left w:type="dxa" w:w="0"/>
-              <w:bottom w:type="dxa" w:w="95"/>
-              <w:right w:type="dxa" w:w="0"/>
-            </w:tcMar>
-          </w:tcPr>
-          <w:p>
-            <w:pPr>
-              <w:spacing w:after="40" w:before="0"/>
+              <w:bottom w:type="dxa" w:w="56"/>
+              <w:right w:type="dxa" w:w="240"/>
+            </w:tcMar>
+          </w:tcPr>
+          <w:p>
+            <w:pPr>
+              <w:spacing w:after="30" w:before="0"/>
             </w:pPr>
             <w:r>
               <w:rPr>
                 <w:rFonts w:ascii="Calibri" w:cs="Calibri" w:eastAsia="Calibri" w:hAnsi="Calibri"/>
                 <w:b/>
                 <w:bCs/>
-                <w:i w:val="false"/>
-                <w:iCs w:val="false"/>
-                <w:color w:val="7C818A"/>
+                <w:color w:val="767369"/>
                 <w:spacing w:val="70"/>
-                <w:sz w:val="13"/>
-                <w:szCs w:val="13"/>
-              </w:rPr>
-              <w:t xml:space="preserve">ORIGEN</w:t>
-            </w:r>
-          </w:p>
-          <w:p>
-            <w:pPr>
-              <w:spacing w:after="0" w:before="0"/>
-            </w:pPr>
-            <w:r>
-              <w:rPr>
-                <w:rFonts w:ascii="Calibri" w:cs="Calibri" w:eastAsia="Calibri" w:hAnsi="Calibri"/>
-                <w:b w:val="false"/>
-                <w:bCs w:val="false"/>
-                <w:i w:val="false"/>
-                <w:iCs w:val="false"/>
-                <w:color w:val="0E0F11"/>
-                <w:sz w:val="21"/>
-                <w:szCs w:val="21"/>
-              </w:rPr>
-              <w:t xml:space="preserve">Monterrey, Nuevo León</w:t>
+                <w:sz w:val="12"/>
+                <w:szCs w:val="12"/>
+              </w:rPr>
+              <w:t xml:space="preserve">ATENCIÓN</w:t>
+            </w:r>
+          </w:p>
+          <w:p>
+            <w:pPr>
+              <w:spacing w:after="0" w:before="0"/>
+            </w:pPr>
+            <w:r>
+              <w:rPr>
+                <w:rFonts w:ascii="Calibri" w:cs="Calibri" w:eastAsia="Calibri" w:hAnsi="Calibri"/>
+                <w:b w:val="false"/>
+                <w:bCs w:val="false"/>
+                <w:color w:val="95908A"/>
+                <w:sz w:val="19"/>
+                <w:szCs w:val="19"/>
+              </w:rPr>
+              <w:t xml:space="preserve">[ Nombre y puesto ]</w:t>
+            </w:r>
+          </w:p>
+        </w:tc>
+        <w:tc>
+          <w:tcPr>
+            <w:tcW w:type="dxa" w:w="3168"/>
+            <w:tcMar>
+              <w:top w:type="dxa" w:w="56"/>
+              <w:left w:type="dxa" w:w="0"/>
+              <w:bottom w:type="dxa" w:w="56"/>
+              <w:right w:type="dxa" w:w="0"/>
+            </w:tcMar>
+          </w:tcPr>
+          <w:p>
+            <w:pPr>
+              <w:spacing w:after="30" w:before="0"/>
+            </w:pPr>
+            <w:r>
+              <w:rPr>
+                <w:rFonts w:ascii="Calibri" w:cs="Calibri" w:eastAsia="Calibri" w:hAnsi="Calibri"/>
+                <w:b/>
+                <w:bCs/>
+                <w:color w:val="767369"/>
+                <w:spacing w:val="70"/>
+                <w:sz w:val="12"/>
+                <w:szCs w:val="12"/>
+              </w:rPr>
+              <w:t xml:space="preserve">CORREO Y TELÉFONO</w:t>
+            </w:r>
+          </w:p>
+          <w:p>
+            <w:pPr>
+              <w:spacing w:after="0" w:before="0"/>
+            </w:pPr>
+            <w:r>
+              <w:rPr>
+                <w:rFonts w:ascii="Calibri" w:cs="Calibri" w:eastAsia="Calibri" w:hAnsi="Calibri"/>
+                <w:b w:val="false"/>
+                <w:bCs w:val="false"/>
+                <w:color w:val="95908A"/>
+                <w:sz w:val="19"/>
+                <w:szCs w:val="19"/>
+              </w:rPr>
+              <w:t xml:space="preserve">[ correo · teléfono ]</w:t>
             </w:r>
           </w:p>
         </w:tc>
@@ -538,79 +542,71 @@
         </w:trPr>
         <w:tc>
           <w:tcPr>
-            <w:tcW w:type="dxa" w:w="4536"/>
-            <w:gridSpan w:val="3"/>
-            <w:tcMar>
-              <w:top w:type="dxa" w:w="95"/>
+            <w:tcW w:type="dxa" w:w="3168"/>
+            <w:tcMar>
+              <w:top w:type="dxa" w:w="56"/>
               <w:left w:type="dxa" w:w="0"/>
-              <w:bottom w:type="dxa" w:w="95"/>
-              <w:right w:type="dxa" w:w="280"/>
-            </w:tcMar>
-          </w:tcPr>
-          <w:p>
-            <w:pPr>
-              <w:spacing w:after="40" w:before="0"/>
+              <w:bottom w:type="dxa" w:w="56"/>
+              <w:right w:type="dxa" w:w="240"/>
+            </w:tcMar>
+          </w:tcPr>
+          <w:p>
+            <w:pPr>
+              <w:spacing w:after="30" w:before="0"/>
             </w:pPr>
             <w:r>
               <w:rPr>
                 <w:rFonts w:ascii="Calibri" w:cs="Calibri" w:eastAsia="Calibri" w:hAnsi="Calibri"/>
                 <w:b/>
                 <w:bCs/>
-                <w:i w:val="false"/>
-                <w:iCs w:val="false"/>
-                <w:color w:val="7C818A"/>
+                <w:color w:val="767369"/>
                 <w:spacing w:val="70"/>
-                <w:sz w:val="13"/>
-                <w:szCs w:val="13"/>
-              </w:rPr>
-              <w:t xml:space="preserve">ATENCIÓN</w:t>
-            </w:r>
-          </w:p>
-          <w:p>
-            <w:pPr>
-              <w:spacing w:after="0" w:before="0"/>
-            </w:pPr>
-            <w:r>
-              <w:rPr>
-                <w:rFonts w:ascii="Calibri" w:cs="Calibri" w:eastAsia="Calibri" w:hAnsi="Calibri"/>
-                <w:b w:val="false"/>
-                <w:bCs w:val="false"/>
-                <w:i w:val="false"/>
-                <w:iCs w:val="false"/>
-                <w:color w:val="A9A29A"/>
-                <w:sz w:val="21"/>
-                <w:szCs w:val="21"/>
-              </w:rPr>
-              <w:t xml:space="preserve">[ Nombre y puesto del contacto ]</w:t>
-            </w:r>
-          </w:p>
-        </w:tc>
-        <w:tc>
-          <w:tcPr>
-            <w:tcW w:type="dxa" w:w="4536"/>
-            <w:gridSpan w:val="3"/>
-            <w:tcMar>
-              <w:top w:type="dxa" w:w="95"/>
+                <w:sz w:val="12"/>
+                <w:szCs w:val="12"/>
+              </w:rPr>
+              <w:t xml:space="preserve">ORIGEN</w:t>
+            </w:r>
+          </w:p>
+          <w:p>
+            <w:pPr>
+              <w:spacing w:after="0" w:before="0"/>
+            </w:pPr>
+            <w:r>
+              <w:rPr>
+                <w:rFonts w:ascii="Calibri" w:cs="Calibri" w:eastAsia="Calibri" w:hAnsi="Calibri"/>
+                <w:b w:val="false"/>
+                <w:bCs w:val="false"/>
+                <w:color w:val="23272B"/>
+                <w:sz w:val="19"/>
+                <w:szCs w:val="19"/>
+              </w:rPr>
+              <w:t xml:space="preserve">Monterrey, Nuevo León</w:t>
+            </w:r>
+          </w:p>
+        </w:tc>
+        <w:tc>
+          <w:tcPr>
+            <w:tcW w:type="dxa" w:w="3168"/>
+            <w:tcMar>
+              <w:top w:type="dxa" w:w="56"/>
               <w:left w:type="dxa" w:w="0"/>
-              <w:bottom w:type="dxa" w:w="95"/>
-              <w:right w:type="dxa" w:w="0"/>
-            </w:tcMar>
-          </w:tcPr>
-          <w:p>
-            <w:pPr>
-              <w:spacing w:after="40" w:before="0"/>
+              <w:bottom w:type="dxa" w:w="56"/>
+              <w:right w:type="dxa" w:w="240"/>
+            </w:tcMar>
+          </w:tcPr>
+          <w:p>
+            <w:pPr>
+              <w:spacing w:after="30" w:before="0"/>
             </w:pPr>
             <w:r>
               <w:rPr>
                 <w:rFonts w:ascii="Calibri" w:cs="Calibri" w:eastAsia="Calibri" w:hAnsi="Calibri"/>
                 <w:b/>
                 <w:bCs/>
-                <w:i w:val="false"/>
-                <w:iCs w:val="false"/>
-                <w:color w:val="7C818A"/>
+                <w:color w:val="767369"/>
                 <w:spacing w:val="70"/>
-                <w:sz w:val="13"/>
-                <w:szCs w:val="13"/>
+                <w:sz w:val="12"/>
+                <w:szCs w:val="12"/>
               </w:rPr>
               <w:t xml:space="preserve">DESTINO</w:t>
             </w:r>
@@ -624,96 +620,37 @@
                 <w:rFonts w:ascii="Calibri" w:cs="Calibri" w:eastAsia="Calibri" w:hAnsi="Calibri"/>
                 <w:b w:val="false"/>
                 <w:bCs w:val="false"/>
-                <w:i w:val="false"/>
-                <w:iCs w:val="false"/>
-                <w:color w:val="0E0F11"/>
-                <w:sz w:val="21"/>
-                <w:szCs w:val="21"/>
+                <w:color w:val="23272B"/>
+                <w:sz w:val="19"/>
+                <w:szCs w:val="19"/>
               </w:rPr>
               <w:t xml:space="preserve">Ciudad de México</w:t>
             </w:r>
           </w:p>
         </w:tc>
-      </w:tr>
-      <w:tr>
-        <w:trPr>
-          <w:cantSplit/>
-        </w:trPr>
-        <w:tc>
-          <w:tcPr>
-            <w:tcW w:type="dxa" w:w="4536"/>
-            <w:gridSpan w:val="3"/>
-            <w:tcMar>
-              <w:top w:type="dxa" w:w="95"/>
+        <w:tc>
+          <w:tcPr>
+            <w:tcW w:type="dxa" w:w="3168"/>
+            <w:tcMar>
+              <w:top w:type="dxa" w:w="56"/>
               <w:left w:type="dxa" w:w="0"/>
-              <w:bottom w:type="dxa" w:w="95"/>
-              <w:right w:type="dxa" w:w="280"/>
-            </w:tcMar>
-          </w:tcPr>
-          <w:p>
-            <w:pPr>
-              <w:spacing w:after="40" w:before="0"/>
+              <w:bottom w:type="dxa" w:w="56"/>
+              <w:right w:type="dxa" w:w="0"/>
+            </w:tcMar>
+          </w:tcPr>
+          <w:p>
+            <w:pPr>
+              <w:spacing w:after="30" w:before="0"/>
             </w:pPr>
             <w:r>
               <w:rPr>
                 <w:rFonts w:ascii="Calibri" w:cs="Calibri" w:eastAsia="Calibri" w:hAnsi="Calibri"/>
                 <w:b/>
                 <w:bCs/>
-                <w:i w:val="false"/>
-                <w:iCs w:val="false"/>
-                <w:color w:val="7C818A"/>
+                <w:color w:val="767369"/>
                 <w:spacing w:val="70"/>
-                <w:sz w:val="13"/>
-                <w:szCs w:val="13"/>
-              </w:rPr>
-              <w:t xml:space="preserve">CORREO Y TELÉFONO</w:t>
-            </w:r>
-          </w:p>
-          <w:p>
-            <w:pPr>
-              <w:spacing w:after="0" w:before="0"/>
-            </w:pPr>
-            <w:r>
-              <w:rPr>
-                <w:rFonts w:ascii="Calibri" w:cs="Calibri" w:eastAsia="Calibri" w:hAnsi="Calibri"/>
-                <w:b w:val="false"/>
-                <w:bCs w:val="false"/>
-                <w:i w:val="false"/>
-                <w:iCs w:val="false"/>
-                <w:color w:val="A9A29A"/>
-                <w:sz w:val="21"/>
-                <w:szCs w:val="21"/>
-              </w:rPr>
-              <w:t xml:space="preserve">[ correo@empresa.com  ·  (00) 0000-0000 ]</w:t>
-            </w:r>
-          </w:p>
-        </w:tc>
-        <w:tc>
-          <w:tcPr>
-            <w:tcW w:type="dxa" w:w="4536"/>
-            <w:gridSpan w:val="3"/>
-            <w:tcMar>
-              <w:top w:type="dxa" w:w="95"/>
-              <w:left w:type="dxa" w:w="0"/>
-              <w:bottom w:type="dxa" w:w="95"/>
-              <w:right w:type="dxa" w:w="0"/>
-            </w:tcMar>
-          </w:tcPr>
-          <w:p>
-            <w:pPr>
-              <w:spacing w:after="40" w:before="0"/>
-            </w:pPr>
-            <w:r>
-              <w:rPr>
-                <w:rFonts w:ascii="Calibri" w:cs="Calibri" w:eastAsia="Calibri" w:hAnsi="Calibri"/>
-                <w:b/>
-                <w:bCs/>
-                <w:i w:val="false"/>
-                <w:iCs w:val="false"/>
-                <w:color w:val="7C818A"/>
-                <w:spacing w:val="70"/>
-                <w:sz w:val="13"/>
-                <w:szCs w:val="13"/>
+                <w:sz w:val="12"/>
+                <w:szCs w:val="12"/>
               </w:rPr>
               <w:t xml:space="preserve">MODALIDAD</w:t>
             </w:r>
@@ -727,11 +664,9 @@
                 <w:rFonts w:ascii="Calibri" w:cs="Calibri" w:eastAsia="Calibri" w:hAnsi="Calibri"/>
                 <w:b w:val="false"/>
                 <w:bCs w:val="false"/>
-                <w:i w:val="false"/>
-                <w:iCs w:val="false"/>
-                <w:color w:val="0E0F11"/>
-                <w:sz w:val="21"/>
-                <w:szCs w:val="21"/>
+                <w:color w:val="23272B"/>
+                <w:sz w:val="19"/>
+                <w:szCs w:val="19"/>
               </w:rPr>
               <w:t xml:space="preserve">Carga consolidada por tarima</w:t>
             </w:r>
@@ -744,21 +679,19 @@
         <w:keepNext/>
         <w:keepLines/>
         <w:pBdr>
-          <w:bottom w:val="single" w:color="D6D3CE" w:sz="4"/>
+          <w:bottom w:val="single" w:color="D9D3C9" w:sz="4"/>
         </w:pBdr>
-        <w:spacing w:after="110" w:before="270"/>
+        <w:spacing w:after="74" w:before="140"/>
       </w:pPr>
       <w:r>
         <w:rPr>
           <w:rFonts w:ascii="Cambria" w:cs="Cambria" w:eastAsia="Cambria" w:hAnsi="Cambria"/>
           <w:b/>
           <w:bCs/>
-          <w:i w:val="false"/>
-          <w:iCs w:val="false"/>
-          <w:color w:val="C21112"/>
+          <w:color w:val="8A3B33"/>
           <w:spacing w:val="10"/>
-          <w:sz w:val="19"/>
-          <w:szCs w:val="19"/>
+          <w:sz w:val="17"/>
+          <w:szCs w:val="17"/>
         </w:rPr>
         <w:t xml:space="preserve">01</w:t>
       </w:r>
@@ -767,11 +700,9 @@
           <w:rFonts w:ascii="Calibri" w:cs="Calibri" w:eastAsia="Calibri" w:hAnsi="Calibri"/>
           <w:b w:val="false"/>
           <w:bCs w:val="false"/>
-          <w:i w:val="false"/>
-          <w:iCs w:val="false"/>
-          <w:color w:val="42464B"/>
-          <w:sz w:val="19"/>
-          <w:szCs w:val="19"/>
+          <w:color w:val="4F545A"/>
+          <w:sz w:val="17"/>
+          <w:szCs w:val="17"/>
         </w:rPr>
         <w:t xml:space="preserve">     </w:t>
       </w:r>
@@ -780,21 +711,19 @@
           <w:rFonts w:ascii="Calibri" w:cs="Calibri" w:eastAsia="Calibri" w:hAnsi="Calibri"/>
           <w:b/>
           <w:bCs/>
-          <w:i w:val="false"/>
-          <w:iCs w:val="false"/>
-          <w:color w:val="0E0F11"/>
+          <w:color w:val="23272B"/>
           <w:spacing w:val="90"/>
-          <w:sz w:val="18"/>
-          <w:szCs w:val="18"/>
+          <w:sz w:val="16"/>
+          <w:szCs w:val="16"/>
         </w:rPr>
-        <w:t xml:space="preserve">PROPUESTA DE SERVICIO</w:t>
+        <w:t xml:space="preserve">MERCANCÍA A TRANSPORTAR</w:t>
       </w:r>
     </w:p>
     <w:p>
       <w:pPr>
         <w:keepNext/>
         <w:keepLines/>
-        <w:spacing w:after="110" w:before="0" w:line="276" w:lineRule="auto"/>
+        <w:spacing w:after="105" w:before="0" w:line="258" w:lineRule="auto"/>
         <w:jc w:val="both"/>
       </w:pPr>
       <w:r>
@@ -802,63 +731,31 @@
           <w:rFonts w:ascii="Cambria" w:cs="Cambria" w:eastAsia="Cambria" w:hAnsi="Cambria"/>
           <w:b w:val="false"/>
           <w:bCs w:val="false"/>
-          <w:i w:val="false"/>
-          <w:iCs w:val="false"/>
-          <w:color w:val="0E0F11"/>
-          <w:sz w:val="22"/>
-          <w:szCs w:val="22"/>
+          <w:color w:val="23272B"/>
+          <w:sz w:val="19"/>
+          <w:szCs w:val="19"/>
         </w:rPr>
-        <w:t xml:space="preserve">A quien corresponda:</w:t>
+        <w:t xml:space="preserve">A quien corresponda: </w:t>
       </w:r>
-    </w:p>
-    <w:p>
-      <w:pPr>
-        <w:keepNext/>
-        <w:keepLines/>
-        <w:spacing w:after="0" w:before="0" w:line="276" w:lineRule="auto"/>
-        <w:jc w:val="both"/>
-      </w:pPr>
       <w:r>
         <w:rPr>
           <w:rFonts w:ascii="Calibri" w:cs="Calibri" w:eastAsia="Calibri" w:hAnsi="Calibri"/>
           <w:b w:val="false"/>
           <w:bCs w:val="false"/>
-          <w:i w:val="false"/>
-          <w:iCs w:val="false"/>
-          <w:color w:val="42464B"/>
-          <w:sz w:val="21"/>
-          <w:szCs w:val="21"/>
+          <w:color w:val="4F545A"/>
+          <w:sz w:val="19"/>
+          <w:szCs w:val="19"/>
         </w:rPr>
-        <w:t xml:space="preserve">Agradecemos la oportunidad de cotizar su requerimiento de transporte. Con base en la información proporcionada, la presente cotización considera el traslado de la mercancía descrita a continuación:</w:t>
-      </w:r>
-    </w:p>
-    <w:p>
-      <w:pPr>
-        <w:keepNext/>
-        <w:keepLines/>
-        <w:spacing w:after="0" w:before="0"/>
-      </w:pPr>
-      <w:r>
-        <w:rPr>
-          <w:rFonts w:ascii="Calibri" w:cs="Calibri" w:eastAsia="Calibri" w:hAnsi="Calibri"/>
-          <w:b w:val="false"/>
-          <w:bCs w:val="false"/>
-          <w:i w:val="false"/>
-          <w:iCs w:val="false"/>
-          <w:color w:val="42464B"/>
-          <w:sz w:val="8"/>
-          <w:szCs w:val="8"/>
-        </w:rPr>
-        <w:t xml:space="preserve"/>
+        <w:t xml:space="preserve">agradecemos la oportunidad de cotizar el siguiente embarque:</w:t>
       </w:r>
     </w:p>
     <w:tbl>
       <w:tblPr>
-        <w:tblW w:type="dxa" w:w="9072"/>
+        <w:tblW w:type="dxa" w:w="9504"/>
         <w:tblBorders>
-          <w:top w:val="single" w:color="D6D3CE" w:sz="4"/>
+          <w:top w:val="single" w:color="D9D3C9" w:sz="4"/>
           <w:left w:val="none"/>
-          <w:bottom w:val="single" w:color="D6D3CE" w:sz="4"/>
+          <w:bottom w:val="single" w:color="D9D3C9" w:sz="4"/>
           <w:right w:val="none"/>
           <w:insideH w:val="none"/>
           <w:insideV w:val="single" w:color="FFFFFF" w:sz="8"/>
@@ -866,10 +763,10 @@
         <w:tblLayout w:type="fixed"/>
       </w:tblPr>
       <w:tblGrid>
-        <w:gridCol w:w="2268"/>
-        <w:gridCol w:w="2268"/>
-        <w:gridCol w:w="2268"/>
-        <w:gridCol w:w="2268"/>
+        <w:gridCol w:w="2376"/>
+        <w:gridCol w:w="2376"/>
+        <w:gridCol w:w="2376"/>
+        <w:gridCol w:w="2376"/>
       </w:tblGrid>
       <w:tr>
         <w:trPr>
@@ -877,32 +774,30 @@
         </w:trPr>
         <w:tc>
           <w:tcPr>
-            <w:tcW w:type="dxa" w:w="2268"/>
-            <w:shd w:fill="F7F6F3" w:color="auto" w:val="clear"/>
-            <w:tcMar>
-              <w:top w:type="dxa" w:w="140"/>
-              <w:left w:type="dxa" w:w="200"/>
-              <w:bottom w:type="dxa" w:w="140"/>
-              <w:right w:type="dxa" w:w="140"/>
+            <w:tcW w:type="dxa" w:w="2376"/>
+            <w:shd w:fill="F5F3EF" w:color="auto" w:val="clear"/>
+            <w:tcMar>
+              <w:top w:type="dxa" w:w="100"/>
+              <w:left w:type="dxa" w:w="190"/>
+              <w:bottom w:type="dxa" w:w="100"/>
+              <w:right w:type="dxa" w:w="130"/>
             </w:tcMar>
           </w:tcPr>
           <w:p>
             <w:pPr>
               <w:keepNext/>
               <w:keepLines/>
-              <w:spacing w:after="55" w:before="0"/>
+              <w:spacing w:after="45" w:before="0"/>
             </w:pPr>
             <w:r>
               <w:rPr>
                 <w:rFonts w:ascii="Calibri" w:cs="Calibri" w:eastAsia="Calibri" w:hAnsi="Calibri"/>
                 <w:b/>
                 <w:bCs/>
-                <w:i w:val="false"/>
-                <w:iCs w:val="false"/>
-                <w:color w:val="7C818A"/>
+                <w:color w:val="767369"/>
                 <w:spacing w:val="70"/>
-                <w:sz w:val="12"/>
-                <w:szCs w:val="12"/>
+                <w:sz w:val="11"/>
+                <w:szCs w:val="11"/>
               </w:rPr>
               <w:t xml:space="preserve">PIEZAS</w:t>
             </w:r>
@@ -918,11 +813,9 @@
                 <w:rFonts w:ascii="Cambria" w:cs="Cambria" w:eastAsia="Cambria" w:hAnsi="Cambria"/>
                 <w:b w:val="false"/>
                 <w:bCs w:val="false"/>
-                <w:i w:val="false"/>
-                <w:iCs w:val="false"/>
-                <w:color w:val="0E0F11"/>
-                <w:sz w:val="22"/>
-                <w:szCs w:val="22"/>
+                <w:color w:val="23272B"/>
+                <w:sz w:val="20"/>
+                <w:szCs w:val="20"/>
               </w:rPr>
               <w:t xml:space="preserve">2 tarimas</w:t>
             </w:r>
@@ -930,32 +823,30 @@
         </w:tc>
         <w:tc>
           <w:tcPr>
-            <w:tcW w:type="dxa" w:w="2268"/>
-            <w:shd w:fill="F7F6F3" w:color="auto" w:val="clear"/>
-            <w:tcMar>
-              <w:top w:type="dxa" w:w="140"/>
-              <w:left w:type="dxa" w:w="200"/>
-              <w:bottom w:type="dxa" w:w="140"/>
-              <w:right w:type="dxa" w:w="140"/>
+            <w:tcW w:type="dxa" w:w="2376"/>
+            <w:shd w:fill="F5F3EF" w:color="auto" w:val="clear"/>
+            <w:tcMar>
+              <w:top w:type="dxa" w:w="100"/>
+              <w:left w:type="dxa" w:w="190"/>
+              <w:bottom w:type="dxa" w:w="100"/>
+              <w:right w:type="dxa" w:w="130"/>
             </w:tcMar>
           </w:tcPr>
           <w:p>
             <w:pPr>
               <w:keepNext/>
               <w:keepLines/>
-              <w:spacing w:after="55" w:before="0"/>
+              <w:spacing w:after="45" w:before="0"/>
             </w:pPr>
             <w:r>
               <w:rPr>
                 <w:rFonts w:ascii="Calibri" w:cs="Calibri" w:eastAsia="Calibri" w:hAnsi="Calibri"/>
                 <w:b/>
                 <w:bCs/>
-                <w:i w:val="false"/>
-                <w:iCs w:val="false"/>
-                <w:color w:val="7C818A"/>
+                <w:color w:val="767369"/>
                 <w:spacing w:val="70"/>
-                <w:sz w:val="12"/>
-                <w:szCs w:val="12"/>
+                <w:sz w:val="11"/>
+                <w:szCs w:val="11"/>
               </w:rPr>
               <w:t xml:space="preserve">DIMENSIONES</w:t>
             </w:r>
@@ -971,11 +862,9 @@
                 <w:rFonts w:ascii="Cambria" w:cs="Cambria" w:eastAsia="Cambria" w:hAnsi="Cambria"/>
                 <w:b w:val="false"/>
                 <w:bCs w:val="false"/>
-                <w:i w:val="false"/>
-                <w:iCs w:val="false"/>
-                <w:color w:val="0E0F11"/>
-                <w:sz w:val="22"/>
-                <w:szCs w:val="22"/>
+                <w:color w:val="23272B"/>
+                <w:sz w:val="20"/>
+                <w:szCs w:val="20"/>
               </w:rPr>
               <w:t xml:space="preserve">1.20 × 1.00 × 1.50 m</w:t>
             </w:r>
@@ -983,32 +872,30 @@
         </w:tc>
         <w:tc>
           <w:tcPr>
-            <w:tcW w:type="dxa" w:w="2268"/>
-            <w:shd w:fill="F7F6F3" w:color="auto" w:val="clear"/>
-            <w:tcMar>
-              <w:top w:type="dxa" w:w="140"/>
-              <w:left w:type="dxa" w:w="200"/>
-              <w:bottom w:type="dxa" w:w="140"/>
-              <w:right w:type="dxa" w:w="140"/>
+            <w:tcW w:type="dxa" w:w="2376"/>
+            <w:shd w:fill="F5F3EF" w:color="auto" w:val="clear"/>
+            <w:tcMar>
+              <w:top w:type="dxa" w:w="100"/>
+              <w:left w:type="dxa" w:w="190"/>
+              <w:bottom w:type="dxa" w:w="100"/>
+              <w:right w:type="dxa" w:w="130"/>
             </w:tcMar>
           </w:tcPr>
           <w:p>
             <w:pPr>
               <w:keepNext/>
               <w:keepLines/>
-              <w:spacing w:after="55" w:before="0"/>
+              <w:spacing w:after="45" w:before="0"/>
             </w:pPr>
             <w:r>
               <w:rPr>
                 <w:rFonts w:ascii="Calibri" w:cs="Calibri" w:eastAsia="Calibri" w:hAnsi="Calibri"/>
                 <w:b/>
                 <w:bCs/>
-                <w:i w:val="false"/>
-                <w:iCs w:val="false"/>
-                <w:color w:val="7C818A"/>
+                <w:color w:val="767369"/>
                 <w:spacing w:val="70"/>
-                <w:sz w:val="12"/>
-                <w:szCs w:val="12"/>
+                <w:sz w:val="11"/>
+                <w:szCs w:val="11"/>
               </w:rPr>
               <w:t xml:space="preserve">PESO APROX.</w:t>
             </w:r>
@@ -1024,11 +911,9 @@
                 <w:rFonts w:ascii="Cambria" w:cs="Cambria" w:eastAsia="Cambria" w:hAnsi="Cambria"/>
                 <w:b w:val="false"/>
                 <w:bCs w:val="false"/>
-                <w:i w:val="false"/>
-                <w:iCs w:val="false"/>
-                <w:color w:val="0E0F11"/>
-                <w:sz w:val="22"/>
-                <w:szCs w:val="22"/>
+                <w:color w:val="23272B"/>
+                <w:sz w:val="20"/>
+                <w:szCs w:val="20"/>
               </w:rPr>
               <w:t xml:space="preserve">2,000 kg</w:t>
             </w:r>
@@ -1036,32 +921,30 @@
         </w:tc>
         <w:tc>
           <w:tcPr>
-            <w:tcW w:type="dxa" w:w="2268"/>
-            <w:shd w:fill="F7F6F3" w:color="auto" w:val="clear"/>
-            <w:tcMar>
-              <w:top w:type="dxa" w:w="140"/>
-              <w:left w:type="dxa" w:w="200"/>
-              <w:bottom w:type="dxa" w:w="140"/>
-              <w:right w:type="dxa" w:w="140"/>
+            <w:tcW w:type="dxa" w:w="2376"/>
+            <w:shd w:fill="F5F3EF" w:color="auto" w:val="clear"/>
+            <w:tcMar>
+              <w:top w:type="dxa" w:w="100"/>
+              <w:left w:type="dxa" w:w="190"/>
+              <w:bottom w:type="dxa" w:w="100"/>
+              <w:right w:type="dxa" w:w="130"/>
             </w:tcMar>
           </w:tcPr>
           <w:p>
             <w:pPr>
               <w:keepNext/>
               <w:keepLines/>
-              <w:spacing w:after="55" w:before="0"/>
+              <w:spacing w:after="45" w:before="0"/>
             </w:pPr>
             <w:r>
               <w:rPr>
                 <w:rFonts w:ascii="Calibri" w:cs="Calibri" w:eastAsia="Calibri" w:hAnsi="Calibri"/>
                 <w:b/>
                 <w:bCs/>
-                <w:i w:val="false"/>
-                <w:iCs w:val="false"/>
-                <w:color w:val="7C818A"/>
+                <w:color w:val="767369"/>
                 <w:spacing w:val="70"/>
-                <w:sz w:val="12"/>
-                <w:szCs w:val="12"/>
+                <w:sz w:val="11"/>
+                <w:szCs w:val="11"/>
               </w:rPr>
               <w:t xml:space="preserve">VOLUMEN</w:t>
             </w:r>
@@ -1077,11 +960,9 @@
                 <w:rFonts w:ascii="Cambria" w:cs="Cambria" w:eastAsia="Cambria" w:hAnsi="Cambria"/>
                 <w:b w:val="false"/>
                 <w:bCs w:val="false"/>
-                <w:i w:val="false"/>
-                <w:iCs w:val="false"/>
-                <w:color w:val="0E0F11"/>
-                <w:sz w:val="22"/>
-                <w:szCs w:val="22"/>
+                <w:color w:val="23272B"/>
+                <w:sz w:val="20"/>
+                <w:szCs w:val="20"/>
               </w:rPr>
               <w:t xml:space="preserve">3.60 m³</w:t>
             </w:r>
@@ -1094,21 +975,19 @@
         <w:keepNext/>
         <w:keepLines/>
         <w:pBdr>
-          <w:bottom w:val="single" w:color="D6D3CE" w:sz="4"/>
+          <w:bottom w:val="single" w:color="D9D3C9" w:sz="4"/>
         </w:pBdr>
-        <w:spacing w:after="110" w:before="270"/>
+        <w:spacing w:after="74" w:before="140"/>
       </w:pPr>
       <w:r>
         <w:rPr>
           <w:rFonts w:ascii="Cambria" w:cs="Cambria" w:eastAsia="Cambria" w:hAnsi="Cambria"/>
           <w:b/>
           <w:bCs/>
-          <w:i w:val="false"/>
-          <w:iCs w:val="false"/>
-          <w:color w:val="C21112"/>
+          <w:color w:val="8A3B33"/>
           <w:spacing w:val="10"/>
-          <w:sz w:val="19"/>
-          <w:szCs w:val="19"/>
+          <w:sz w:val="17"/>
+          <w:szCs w:val="17"/>
         </w:rPr>
         <w:t xml:space="preserve">02</w:t>
       </w:r>
@@ -1117,11 +996,9 @@
           <w:rFonts w:ascii="Calibri" w:cs="Calibri" w:eastAsia="Calibri" w:hAnsi="Calibri"/>
           <w:b w:val="false"/>
           <w:bCs w:val="false"/>
-          <w:i w:val="false"/>
-          <w:iCs w:val="false"/>
-          <w:color w:val="42464B"/>
-          <w:sz w:val="19"/>
-          <w:szCs w:val="19"/>
+          <w:color w:val="4F545A"/>
+          <w:sz w:val="17"/>
+          <w:szCs w:val="17"/>
         </w:rPr>
         <w:t xml:space="preserve">     </w:t>
       </w:r>
@@ -1130,12 +1007,10 @@
           <w:rFonts w:ascii="Calibri" w:cs="Calibri" w:eastAsia="Calibri" w:hAnsi="Calibri"/>
           <w:b/>
           <w:bCs/>
-          <w:i w:val="false"/>
-          <w:iCs w:val="false"/>
-          <w:color w:val="0E0F11"/>
+          <w:color w:val="23272B"/>
           <w:spacing w:val="90"/>
-          <w:sz w:val="18"/>
-          <w:szCs w:val="18"/>
+          <w:sz w:val="16"/>
+          <w:szCs w:val="16"/>
         </w:rPr>
         <w:t xml:space="preserve">PROPUESTA ECONÓMICA</w:t>
       </w:r>
@@ -1151,9 +1026,7 @@
           <w:rFonts w:ascii="Calibri" w:cs="Calibri" w:eastAsia="Calibri" w:hAnsi="Calibri"/>
           <w:b w:val="false"/>
           <w:bCs w:val="false"/>
-          <w:i w:val="false"/>
-          <w:iCs w:val="false"/>
-          <w:color w:val="42464B"/>
+          <w:color w:val="4F545A"/>
           <w:sz w:val="4"/>
           <w:szCs w:val="4"/>
         </w:rPr>
@@ -1162,7 +1035,7 @@
     </w:p>
     <w:tbl>
       <w:tblPr>
-        <w:tblW w:type="dxa" w:w="9072"/>
+        <w:tblW w:type="dxa" w:w="9504"/>
         <w:tblBorders>
           <w:top w:val="none"/>
           <w:left w:val="none"/>
@@ -1174,8 +1047,8 @@
         <w:tblLayout w:type="fixed"/>
       </w:tblPr>
       <w:tblGrid>
-        <w:gridCol w:w="5772"/>
-        <w:gridCol w:w="3300"/>
+        <w:gridCol w:w="6100"/>
+        <w:gridCol w:w="3404"/>
       </w:tblGrid>
       <w:tr>
         <w:trPr>
@@ -1183,13 +1056,13 @@
         </w:trPr>
         <w:tc>
           <w:tcPr>
-            <w:tcW w:type="dxa" w:w="5772"/>
-            <w:shd w:fill="0E0F11" w:color="auto" w:val="clear"/>
-            <w:tcMar>
-              <w:top w:type="dxa" w:w="105"/>
-              <w:left w:type="dxa" w:w="200"/>
-              <w:bottom w:type="dxa" w:w="105"/>
-              <w:right w:type="dxa" w:w="160"/>
+            <w:tcW w:type="dxa" w:w="6100"/>
+            <w:shd w:fill="2B2F34" w:color="auto" w:val="clear"/>
+            <w:tcMar>
+              <w:top w:type="dxa" w:w="88"/>
+              <w:left w:type="dxa" w:w="190"/>
+              <w:bottom w:type="dxa" w:w="88"/>
+              <w:right w:type="dxa" w:w="150"/>
             </w:tcMar>
             <w:vAlign w:val="center"/>
           </w:tcPr>
@@ -1204,12 +1077,10 @@
                 <w:rFonts w:ascii="Calibri" w:cs="Calibri" w:eastAsia="Calibri" w:hAnsi="Calibri"/>
                 <w:b/>
                 <w:bCs/>
-                <w:i w:val="false"/>
-                <w:iCs w:val="false"/>
                 <w:color w:val="FFFFFF"/>
                 <w:spacing w:val="100"/>
-                <w:sz w:val="14"/>
-                <w:szCs w:val="14"/>
+                <w:sz w:val="13"/>
+                <w:szCs w:val="13"/>
               </w:rPr>
               <w:t xml:space="preserve">CONCEPTO</w:t>
             </w:r>
@@ -1217,13 +1088,13 @@
         </w:tc>
         <w:tc>
           <w:tcPr>
-            <w:tcW w:type="dxa" w:w="3300"/>
-            <w:shd w:fill="0E0F11" w:color="auto" w:val="clear"/>
-            <w:tcMar>
-              <w:top w:type="dxa" w:w="105"/>
-              <w:left w:type="dxa" w:w="160"/>
-              <w:bottom w:type="dxa" w:w="105"/>
-              <w:right w:type="dxa" w:w="200"/>
+            <w:tcW w:type="dxa" w:w="3404"/>
+            <w:shd w:fill="2B2F34" w:color="auto" w:val="clear"/>
+            <w:tcMar>
+              <w:top w:type="dxa" w:w="88"/>
+              <w:left w:type="dxa" w:w="150"/>
+              <w:bottom w:type="dxa" w:w="88"/>
+              <w:right w:type="dxa" w:w="190"/>
             </w:tcMar>
             <w:vAlign w:val="center"/>
           </w:tcPr>
@@ -1239,12 +1110,10 @@
                 <w:rFonts w:ascii="Calibri" w:cs="Calibri" w:eastAsia="Calibri" w:hAnsi="Calibri"/>
                 <w:b/>
                 <w:bCs/>
-                <w:i w:val="false"/>
-                <w:iCs w:val="false"/>
                 <w:color w:val="FFFFFF"/>
                 <w:spacing w:val="100"/>
-                <w:sz w:val="14"/>
-                <w:szCs w:val="14"/>
+                <w:sz w:val="13"/>
+                <w:szCs w:val="13"/>
               </w:rPr>
               <w:t xml:space="preserve">COSTO</w:t>
             </w:r>
@@ -1257,18 +1126,18 @@
         </w:trPr>
         <w:tc>
           <w:tcPr>
-            <w:tcW w:type="dxa" w:w="5772"/>
+            <w:tcW w:type="dxa" w:w="6100"/>
             <w:tcBorders>
               <w:top w:val="none"/>
               <w:left w:val="none"/>
-              <w:bottom w:val="single" w:color="E9E6E1" w:sz="4"/>
+              <w:bottom w:val="single" w:color="EBE7E0" w:sz="4"/>
               <w:right w:val="none"/>
             </w:tcBorders>
             <w:tcMar>
-              <w:top w:type="dxa" w:w="95"/>
-              <w:left w:type="dxa" w:w="200"/>
-              <w:bottom w:type="dxa" w:w="95"/>
-              <w:right w:type="dxa" w:w="160"/>
+              <w:top w:type="dxa" w:w="72"/>
+              <w:left w:type="dxa" w:w="190"/>
+              <w:bottom w:type="dxa" w:w="72"/>
+              <w:right w:type="dxa" w:w="150"/>
             </w:tcMar>
             <w:vAlign w:val="center"/>
           </w:tcPr>
@@ -1276,18 +1145,16 @@
             <w:pPr>
               <w:keepNext/>
               <w:keepLines/>
-              <w:spacing w:after="40" w:before="0"/>
-            </w:pPr>
-            <w:r>
-              <w:rPr>
-                <w:rFonts w:ascii="Calibri" w:cs="Calibri" w:eastAsia="Calibri" w:hAnsi="Calibri"/>
-                <w:b w:val="false"/>
-                <w:bCs w:val="false"/>
-                <w:i w:val="false"/>
-                <w:iCs w:val="false"/>
-                <w:color w:val="0E0F11"/>
-                <w:sz w:val="22"/>
-                <w:szCs w:val="22"/>
+              <w:spacing w:after="30" w:before="0"/>
+            </w:pPr>
+            <w:r>
+              <w:rPr>
+                <w:rFonts w:ascii="Calibri" w:cs="Calibri" w:eastAsia="Calibri" w:hAnsi="Calibri"/>
+                <w:b w:val="false"/>
+                <w:bCs w:val="false"/>
+                <w:color w:val="23272B"/>
+                <w:sz w:val="20"/>
+                <w:szCs w:val="20"/>
               </w:rPr>
               <w:t xml:space="preserve">Recolección</w:t>
             </w:r>
@@ -1303,11 +1170,9 @@
                 <w:rFonts w:ascii="Calibri" w:cs="Calibri" w:eastAsia="Calibri" w:hAnsi="Calibri"/>
                 <w:b w:val="false"/>
                 <w:bCs w:val="false"/>
-                <w:i w:val="false"/>
-                <w:iCs w:val="false"/>
-                <w:color w:val="7C818A"/>
-                <w:sz w:val="16"/>
-                <w:szCs w:val="16"/>
+                <w:color w:val="767369"/>
+                <w:sz w:val="14"/>
+                <w:szCs w:val="14"/>
               </w:rPr>
               <w:t xml:space="preserve">Unidad tipo rabón en la plaza de origen</w:t>
             </w:r>
@@ -1315,18 +1180,18 @@
         </w:tc>
         <w:tc>
           <w:tcPr>
-            <w:tcW w:type="dxa" w:w="3300"/>
+            <w:tcW w:type="dxa" w:w="3404"/>
             <w:tcBorders>
               <w:top w:val="none"/>
               <w:left w:val="none"/>
-              <w:bottom w:val="single" w:color="E9E6E1" w:sz="4"/>
+              <w:bottom w:val="single" w:color="EBE7E0" w:sz="4"/>
               <w:right w:val="none"/>
             </w:tcBorders>
             <w:tcMar>
-              <w:top w:type="dxa" w:w="95"/>
-              <w:left w:type="dxa" w:w="160"/>
-              <w:bottom w:type="dxa" w:w="95"/>
-              <w:right w:type="dxa" w:w="200"/>
+              <w:top w:type="dxa" w:w="72"/>
+              <w:left w:type="dxa" w:w="150"/>
+              <w:bottom w:type="dxa" w:w="72"/>
+              <w:right w:type="dxa" w:w="190"/>
             </w:tcMar>
             <w:vAlign w:val="center"/>
           </w:tcPr>
@@ -1342,11 +1207,9 @@
                 <w:rFonts w:ascii="Cambria" w:cs="Cambria" w:eastAsia="Cambria" w:hAnsi="Cambria"/>
                 <w:b w:val="false"/>
                 <w:bCs w:val="false"/>
-                <w:i w:val="false"/>
-                <w:iCs w:val="false"/>
-                <w:color w:val="0E0F11"/>
-                <w:sz w:val="23"/>
-                <w:szCs w:val="23"/>
+                <w:color w:val="23272B"/>
+                <w:sz w:val="21"/>
+                <w:szCs w:val="21"/>
               </w:rPr>
               <w:t xml:space="preserve">$ 0.00</w:t>
             </w:r>
@@ -1359,18 +1222,18 @@
         </w:trPr>
         <w:tc>
           <w:tcPr>
-            <w:tcW w:type="dxa" w:w="5772"/>
+            <w:tcW w:type="dxa" w:w="6100"/>
             <w:tcBorders>
               <w:top w:val="none"/>
               <w:left w:val="none"/>
-              <w:bottom w:val="single" w:color="E9E6E1" w:sz="4"/>
+              <w:bottom w:val="single" w:color="EBE7E0" w:sz="4"/>
               <w:right w:val="none"/>
             </w:tcBorders>
             <w:tcMar>
-              <w:top w:type="dxa" w:w="95"/>
-              <w:left w:type="dxa" w:w="200"/>
-              <w:bottom w:type="dxa" w:w="95"/>
-              <w:right w:type="dxa" w:w="160"/>
+              <w:top w:type="dxa" w:w="72"/>
+              <w:left w:type="dxa" w:w="190"/>
+              <w:bottom w:type="dxa" w:w="72"/>
+              <w:right w:type="dxa" w:w="150"/>
             </w:tcMar>
             <w:vAlign w:val="center"/>
           </w:tcPr>
@@ -1378,18 +1241,16 @@
             <w:pPr>
               <w:keepNext/>
               <w:keepLines/>
-              <w:spacing w:after="40" w:before="0"/>
-            </w:pPr>
-            <w:r>
-              <w:rPr>
-                <w:rFonts w:ascii="Calibri" w:cs="Calibri" w:eastAsia="Calibri" w:hAnsi="Calibri"/>
-                <w:b w:val="false"/>
-                <w:bCs w:val="false"/>
-                <w:i w:val="false"/>
-                <w:iCs w:val="false"/>
-                <w:color w:val="0E0F11"/>
-                <w:sz w:val="22"/>
-                <w:szCs w:val="22"/>
+              <w:spacing w:after="30" w:before="0"/>
+            </w:pPr>
+            <w:r>
+              <w:rPr>
+                <w:rFonts w:ascii="Calibri" w:cs="Calibri" w:eastAsia="Calibri" w:hAnsi="Calibri"/>
+                <w:b w:val="false"/>
+                <w:bCs w:val="false"/>
+                <w:color w:val="23272B"/>
+                <w:sz w:val="20"/>
+                <w:szCs w:val="20"/>
               </w:rPr>
               <w:t xml:space="preserve">Flete</w:t>
             </w:r>
@@ -1405,11 +1266,9 @@
                 <w:rFonts w:ascii="Calibri" w:cs="Calibri" w:eastAsia="Calibri" w:hAnsi="Calibri"/>
                 <w:b w:val="false"/>
                 <w:bCs w:val="false"/>
-                <w:i w:val="false"/>
-                <w:iCs w:val="false"/>
-                <w:color w:val="7C818A"/>
-                <w:sz w:val="16"/>
-                <w:szCs w:val="16"/>
+                <w:color w:val="767369"/>
+                <w:sz w:val="14"/>
+                <w:szCs w:val="14"/>
               </w:rPr>
               <w:t xml:space="preserve">Monterrey – Ciudad de México, tráiler con caja seca de 48 o 53 pies</w:t>
             </w:r>
@@ -1417,18 +1276,18 @@
         </w:tc>
         <w:tc>
           <w:tcPr>
-            <w:tcW w:type="dxa" w:w="3300"/>
+            <w:tcW w:type="dxa" w:w="3404"/>
             <w:tcBorders>
               <w:top w:val="none"/>
               <w:left w:val="none"/>
-              <w:bottom w:val="single" w:color="E9E6E1" w:sz="4"/>
+              <w:bottom w:val="single" w:color="EBE7E0" w:sz="4"/>
               <w:right w:val="none"/>
             </w:tcBorders>
             <w:tcMar>
-              <w:top w:type="dxa" w:w="95"/>
-              <w:left w:type="dxa" w:w="160"/>
-              <w:bottom w:type="dxa" w:w="95"/>
-              <w:right w:type="dxa" w:w="200"/>
+              <w:top w:type="dxa" w:w="72"/>
+              <w:left w:type="dxa" w:w="150"/>
+              <w:bottom w:type="dxa" w:w="72"/>
+              <w:right w:type="dxa" w:w="190"/>
             </w:tcMar>
             <w:vAlign w:val="center"/>
           </w:tcPr>
@@ -1444,11 +1303,9 @@
                 <w:rFonts w:ascii="Cambria" w:cs="Cambria" w:eastAsia="Cambria" w:hAnsi="Cambria"/>
                 <w:b w:val="false"/>
                 <w:bCs w:val="false"/>
-                <w:i w:val="false"/>
-                <w:iCs w:val="false"/>
-                <w:color w:val="0E0F11"/>
-                <w:sz w:val="23"/>
-                <w:szCs w:val="23"/>
+                <w:color w:val="23272B"/>
+                <w:sz w:val="21"/>
+                <w:szCs w:val="21"/>
               </w:rPr>
               <w:t xml:space="preserve">$ 0.00</w:t>
             </w:r>
@@ -1461,18 +1318,18 @@
         </w:trPr>
         <w:tc>
           <w:tcPr>
-            <w:tcW w:type="dxa" w:w="5772"/>
+            <w:tcW w:type="dxa" w:w="6100"/>
             <w:tcBorders>
               <w:top w:val="none"/>
               <w:left w:val="none"/>
-              <w:bottom w:val="single" w:color="E9E6E1" w:sz="4"/>
+              <w:bottom w:val="single" w:color="EBE7E0" w:sz="4"/>
               <w:right w:val="none"/>
             </w:tcBorders>
             <w:tcMar>
-              <w:top w:type="dxa" w:w="95"/>
-              <w:left w:type="dxa" w:w="200"/>
-              <w:bottom w:type="dxa" w:w="95"/>
-              <w:right w:type="dxa" w:w="160"/>
+              <w:top w:type="dxa" w:w="72"/>
+              <w:left w:type="dxa" w:w="190"/>
+              <w:bottom w:type="dxa" w:w="72"/>
+              <w:right w:type="dxa" w:w="150"/>
             </w:tcMar>
             <w:vAlign w:val="center"/>
           </w:tcPr>
@@ -1480,18 +1337,16 @@
             <w:pPr>
               <w:keepNext/>
               <w:keepLines/>
-              <w:spacing w:after="40" w:before="0"/>
-            </w:pPr>
-            <w:r>
-              <w:rPr>
-                <w:rFonts w:ascii="Calibri" w:cs="Calibri" w:eastAsia="Calibri" w:hAnsi="Calibri"/>
-                <w:b w:val="false"/>
-                <w:bCs w:val="false"/>
-                <w:i w:val="false"/>
-                <w:iCs w:val="false"/>
-                <w:color w:val="0E0F11"/>
-                <w:sz w:val="22"/>
-                <w:szCs w:val="22"/>
+              <w:spacing w:after="30" w:before="0"/>
+            </w:pPr>
+            <w:r>
+              <w:rPr>
+                <w:rFonts w:ascii="Calibri" w:cs="Calibri" w:eastAsia="Calibri" w:hAnsi="Calibri"/>
+                <w:b w:val="false"/>
+                <w:bCs w:val="false"/>
+                <w:color w:val="23272B"/>
+                <w:sz w:val="20"/>
+                <w:szCs w:val="20"/>
               </w:rPr>
               <w:t xml:space="preserve">Servicio de entrega</w:t>
             </w:r>
@@ -1507,11 +1362,9 @@
                 <w:rFonts w:ascii="Calibri" w:cs="Calibri" w:eastAsia="Calibri" w:hAnsi="Calibri"/>
                 <w:b w:val="false"/>
                 <w:bCs w:val="false"/>
-                <w:i w:val="false"/>
-                <w:iCs w:val="false"/>
-                <w:color w:val="7C818A"/>
-                <w:sz w:val="16"/>
-                <w:szCs w:val="16"/>
+                <w:color w:val="767369"/>
+                <w:sz w:val="14"/>
+                <w:szCs w:val="14"/>
               </w:rPr>
               <w:t xml:space="preserve">Unidad tipo rabón en la plaza de destino</w:t>
             </w:r>
@@ -1519,18 +1372,18 @@
         </w:tc>
         <w:tc>
           <w:tcPr>
-            <w:tcW w:type="dxa" w:w="3300"/>
+            <w:tcW w:type="dxa" w:w="3404"/>
             <w:tcBorders>
               <w:top w:val="none"/>
               <w:left w:val="none"/>
-              <w:bottom w:val="single" w:color="E9E6E1" w:sz="4"/>
+              <w:bottom w:val="single" w:color="EBE7E0" w:sz="4"/>
               <w:right w:val="none"/>
             </w:tcBorders>
             <w:tcMar>
-              <w:top w:type="dxa" w:w="95"/>
-              <w:left w:type="dxa" w:w="160"/>
-              <w:bottom w:type="dxa" w:w="95"/>
-              <w:right w:type="dxa" w:w="200"/>
+              <w:top w:type="dxa" w:w="72"/>
+              <w:left w:type="dxa" w:w="150"/>
+              <w:bottom w:type="dxa" w:w="72"/>
+              <w:right w:type="dxa" w:w="190"/>
             </w:tcMar>
             <w:vAlign w:val="center"/>
           </w:tcPr>
@@ -1546,11 +1399,9 @@
                 <w:rFonts w:ascii="Cambria" w:cs="Cambria" w:eastAsia="Cambria" w:hAnsi="Cambria"/>
                 <w:b w:val="false"/>
                 <w:bCs w:val="false"/>
-                <w:i w:val="false"/>
-                <w:iCs w:val="false"/>
-                <w:color w:val="0E0F11"/>
-                <w:sz w:val="23"/>
-                <w:szCs w:val="23"/>
+                <w:color w:val="23272B"/>
+                <w:sz w:val="21"/>
+                <w:szCs w:val="21"/>
               </w:rPr>
               <w:t xml:space="preserve">$ 0.00</w:t>
             </w:r>
@@ -1563,18 +1414,18 @@
         </w:trPr>
         <w:tc>
           <w:tcPr>
-            <w:tcW w:type="dxa" w:w="5772"/>
+            <w:tcW w:type="dxa" w:w="6100"/>
             <w:tcBorders>
-              <w:top w:val="single" w:color="D6D3CE" w:sz="4"/>
+              <w:top w:val="single" w:color="D9D3C9" w:sz="4"/>
               <w:left w:val="none"/>
               <w:bottom w:val="none"/>
               <w:right w:val="none"/>
             </w:tcBorders>
             <w:tcMar>
-              <w:top w:type="dxa" w:w="88"/>
-              <w:left w:type="dxa" w:w="200"/>
-              <w:bottom w:type="dxa" w:w="88"/>
-              <w:right w:type="dxa" w:w="160"/>
+              <w:top w:type="dxa" w:w="66"/>
+              <w:left w:type="dxa" w:w="190"/>
+              <w:bottom w:type="dxa" w:w="66"/>
+              <w:right w:type="dxa" w:w="150"/>
             </w:tcMar>
             <w:vAlign w:val="center"/>
           </w:tcPr>
@@ -1590,12 +1441,10 @@
                 <w:rFonts w:ascii="Calibri" w:cs="Calibri" w:eastAsia="Calibri" w:hAnsi="Calibri"/>
                 <w:b/>
                 <w:bCs/>
-                <w:i w:val="false"/>
-                <w:iCs w:val="false"/>
-                <w:color w:val="7C818A"/>
+                <w:color w:val="767369"/>
                 <w:spacing w:val="80"/>
-                <w:sz w:val="14"/>
-                <w:szCs w:val="14"/>
+                <w:sz w:val="13"/>
+                <w:szCs w:val="13"/>
               </w:rPr>
               <w:t xml:space="preserve">SUBTOTAL</w:t>
             </w:r>
@@ -1603,18 +1452,18 @@
         </w:tc>
         <w:tc>
           <w:tcPr>
-            <w:tcW w:type="dxa" w:w="3300"/>
+            <w:tcW w:type="dxa" w:w="3404"/>
             <w:tcBorders>
-              <w:top w:val="single" w:color="D6D3CE" w:sz="4"/>
+              <w:top w:val="single" w:color="D9D3C9" w:sz="4"/>
               <w:left w:val="none"/>
               <w:bottom w:val="none"/>
               <w:right w:val="none"/>
             </w:tcBorders>
             <w:tcMar>
-              <w:top w:type="dxa" w:w="88"/>
-              <w:left w:type="dxa" w:w="160"/>
-              <w:bottom w:type="dxa" w:w="88"/>
-              <w:right w:type="dxa" w:w="200"/>
+              <w:top w:type="dxa" w:w="66"/>
+              <w:left w:type="dxa" w:w="150"/>
+              <w:bottom w:type="dxa" w:w="66"/>
+              <w:right w:type="dxa" w:w="190"/>
             </w:tcMar>
             <w:vAlign w:val="center"/>
           </w:tcPr>
@@ -1630,11 +1479,9 @@
                 <w:rFonts w:ascii="Cambria" w:cs="Cambria" w:eastAsia="Cambria" w:hAnsi="Cambria"/>
                 <w:b w:val="false"/>
                 <w:bCs w:val="false"/>
-                <w:i w:val="false"/>
-                <w:iCs w:val="false"/>
-                <w:color w:val="0E0F11"/>
-                <w:sz w:val="22"/>
-                <w:szCs w:val="22"/>
+                <w:color w:val="23272B"/>
+                <w:sz w:val="20"/>
+                <w:szCs w:val="20"/>
               </w:rPr>
               <w:t xml:space="preserve">$ 0.00</w:t>
             </w:r>
@@ -1647,7 +1494,7 @@
         </w:trPr>
         <w:tc>
           <w:tcPr>
-            <w:tcW w:type="dxa" w:w="5772"/>
+            <w:tcW w:type="dxa" w:w="6100"/>
             <w:tcBorders>
               <w:top w:val="none"/>
               <w:left w:val="none"/>
@@ -1655,10 +1502,10 @@
               <w:right w:val="none"/>
             </w:tcBorders>
             <w:tcMar>
-              <w:top w:type="dxa" w:w="88"/>
-              <w:left w:type="dxa" w:w="200"/>
-              <w:bottom w:type="dxa" w:w="88"/>
-              <w:right w:type="dxa" w:w="160"/>
+              <w:top w:type="dxa" w:w="66"/>
+              <w:left w:type="dxa" w:w="190"/>
+              <w:bottom w:type="dxa" w:w="66"/>
+              <w:right w:type="dxa" w:w="150"/>
             </w:tcMar>
             <w:vAlign w:val="center"/>
           </w:tcPr>
@@ -1674,12 +1521,10 @@
                 <w:rFonts w:ascii="Calibri" w:cs="Calibri" w:eastAsia="Calibri" w:hAnsi="Calibri"/>
                 <w:b/>
                 <w:bCs/>
-                <w:i w:val="false"/>
-                <w:iCs w:val="false"/>
-                <w:color w:val="7C818A"/>
+                <w:color w:val="767369"/>
                 <w:spacing w:val="80"/>
-                <w:sz w:val="14"/>
-                <w:szCs w:val="14"/>
+                <w:sz w:val="13"/>
+                <w:szCs w:val="13"/>
               </w:rPr>
               <w:t xml:space="preserve">IVA 16 %</w:t>
             </w:r>
@@ -1687,7 +1532,7 @@
         </w:tc>
         <w:tc>
           <w:tcPr>
-            <w:tcW w:type="dxa" w:w="3300"/>
+            <w:tcW w:type="dxa" w:w="3404"/>
             <w:tcBorders>
               <w:top w:val="none"/>
               <w:left w:val="none"/>
@@ -1695,10 +1540,10 @@
               <w:right w:val="none"/>
             </w:tcBorders>
             <w:tcMar>
-              <w:top w:type="dxa" w:w="88"/>
-              <w:left w:type="dxa" w:w="160"/>
-              <w:bottom w:type="dxa" w:w="88"/>
-              <w:right w:type="dxa" w:w="200"/>
+              <w:top w:type="dxa" w:w="66"/>
+              <w:left w:type="dxa" w:w="150"/>
+              <w:bottom w:type="dxa" w:w="66"/>
+              <w:right w:type="dxa" w:w="190"/>
             </w:tcMar>
             <w:vAlign w:val="center"/>
           </w:tcPr>
@@ -1714,11 +1559,9 @@
                 <w:rFonts w:ascii="Cambria" w:cs="Cambria" w:eastAsia="Cambria" w:hAnsi="Cambria"/>
                 <w:b w:val="false"/>
                 <w:bCs w:val="false"/>
-                <w:i w:val="false"/>
-                <w:iCs w:val="false"/>
-                <w:color w:val="0E0F11"/>
-                <w:sz w:val="22"/>
-                <w:szCs w:val="22"/>
+                <w:color w:val="23272B"/>
+                <w:sz w:val="20"/>
+                <w:szCs w:val="20"/>
               </w:rPr>
               <w:t xml:space="preserve">$ 0.00</w:t>
             </w:r>
@@ -1731,19 +1574,19 @@
         </w:trPr>
         <w:tc>
           <w:tcPr>
-            <w:tcW w:type="dxa" w:w="5772"/>
+            <w:tcW w:type="dxa" w:w="6100"/>
             <w:tcBorders>
               <w:top w:val="none"/>
               <w:left w:val="none"/>
               <w:bottom w:val="none"/>
               <w:right w:val="none"/>
             </w:tcBorders>
-            <w:shd w:fill="0E0F11" w:color="auto" w:val="clear"/>
-            <w:tcMar>
-              <w:top w:type="dxa" w:w="88"/>
-              <w:left w:type="dxa" w:w="200"/>
-              <w:bottom w:type="dxa" w:w="88"/>
-              <w:right w:type="dxa" w:w="160"/>
+            <w:shd w:fill="6E2E28" w:color="auto" w:val="clear"/>
+            <w:tcMar>
+              <w:top w:type="dxa" w:w="66"/>
+              <w:left w:type="dxa" w:w="190"/>
+              <w:bottom w:type="dxa" w:w="66"/>
+              <w:right w:type="dxa" w:w="150"/>
             </w:tcMar>
             <w:vAlign w:val="center"/>
           </w:tcPr>
@@ -1757,12 +1600,10 @@
                 <w:rFonts w:ascii="Calibri" w:cs="Calibri" w:eastAsia="Calibri" w:hAnsi="Calibri"/>
                 <w:b/>
                 <w:bCs/>
-                <w:i w:val="false"/>
-                <w:iCs w:val="false"/>
                 <w:color w:val="FFFFFF"/>
                 <w:spacing w:val="80"/>
-                <w:sz w:val="14"/>
-                <w:szCs w:val="14"/>
+                <w:sz w:val="13"/>
+                <w:szCs w:val="13"/>
               </w:rPr>
               <w:t xml:space="preserve">TOTAL</w:t>
             </w:r>
@@ -1770,19 +1611,19 @@
         </w:tc>
         <w:tc>
           <w:tcPr>
-            <w:tcW w:type="dxa" w:w="3300"/>
+            <w:tcW w:type="dxa" w:w="3404"/>
             <w:tcBorders>
               <w:top w:val="none"/>
               <w:left w:val="none"/>
               <w:bottom w:val="none"/>
               <w:right w:val="none"/>
             </w:tcBorders>
-            <w:shd w:fill="0E0F11" w:color="auto" w:val="clear"/>
-            <w:tcMar>
-              <w:top w:type="dxa" w:w="88"/>
-              <w:left w:type="dxa" w:w="160"/>
-              <w:bottom w:type="dxa" w:w="88"/>
-              <w:right w:type="dxa" w:w="200"/>
+            <w:shd w:fill="6E2E28" w:color="auto" w:val="clear"/>
+            <w:tcMar>
+              <w:top w:type="dxa" w:w="66"/>
+              <w:left w:type="dxa" w:w="150"/>
+              <w:bottom w:type="dxa" w:w="66"/>
+              <w:right w:type="dxa" w:w="190"/>
             </w:tcMar>
             <w:vAlign w:val="center"/>
           </w:tcPr>
@@ -1796,11 +1637,9 @@
                 <w:rFonts w:ascii="Cambria" w:cs="Cambria" w:eastAsia="Cambria" w:hAnsi="Cambria"/>
                 <w:b/>
                 <w:bCs/>
-                <w:i w:val="false"/>
-                <w:iCs w:val="false"/>
                 <w:color w:val="FFFFFF"/>
-                <w:sz w:val="28"/>
-                <w:szCs w:val="28"/>
+                <w:sz w:val="25"/>
+                <w:szCs w:val="25"/>
               </w:rPr>
               <w:t xml:space="preserve">$ 0.00</w:t>
             </w:r>
@@ -1817,11 +1656,9 @@
           <w:rFonts w:ascii="Calibri" w:cs="Calibri" w:eastAsia="Calibri" w:hAnsi="Calibri"/>
           <w:b w:val="false"/>
           <w:bCs w:val="false"/>
-          <w:i w:val="false"/>
-          <w:iCs w:val="false"/>
-          <w:color w:val="42464B"/>
-          <w:sz w:val="6"/>
-          <w:szCs w:val="6"/>
+          <w:color w:val="4F545A"/>
+          <w:sz w:val="4"/>
+          <w:szCs w:val="4"/>
         </w:rPr>
         <w:t xml:space="preserve"/>
       </w:r>
@@ -1835,11 +1672,9 @@
           <w:rFonts w:ascii="Calibri" w:cs="Calibri" w:eastAsia="Calibri" w:hAnsi="Calibri"/>
           <w:b w:val="false"/>
           <w:bCs w:val="false"/>
-          <w:i w:val="false"/>
-          <w:iCs w:val="false"/>
-          <w:color w:val="7C818A"/>
-          <w:sz w:val="16"/>
-          <w:szCs w:val="16"/>
+          <w:color w:val="767369"/>
+          <w:sz w:val="14"/>
+          <w:szCs w:val="14"/>
         </w:rPr>
         <w:t xml:space="preserve">Importes expresados en pesos mexicanos (M.N.). El IVA se calcula a la tasa vigente del 16 %.</w:t>
       </w:r>
@@ -1848,23 +1683,20 @@
       <w:pPr>
         <w:keepNext/>
         <w:keepLines/>
-        <w:pageBreakBefore/>
         <w:pBdr>
-          <w:bottom w:val="single" w:color="D6D3CE" w:sz="4"/>
+          <w:bottom w:val="single" w:color="D9D3C9" w:sz="4"/>
         </w:pBdr>
-        <w:spacing w:after="110" w:before="0"/>
+        <w:spacing w:after="74" w:before="140"/>
       </w:pPr>
       <w:r>
         <w:rPr>
           <w:rFonts w:ascii="Cambria" w:cs="Cambria" w:eastAsia="Cambria" w:hAnsi="Cambria"/>
           <w:b/>
           <w:bCs/>
-          <w:i w:val="false"/>
-          <w:iCs w:val="false"/>
-          <w:color w:val="C21112"/>
+          <w:color w:val="8A3B33"/>
           <w:spacing w:val="10"/>
-          <w:sz w:val="19"/>
-          <w:szCs w:val="19"/>
+          <w:sz w:val="17"/>
+          <w:szCs w:val="17"/>
         </w:rPr>
         <w:t xml:space="preserve">03</w:t>
       </w:r>
@@ -1873,11 +1705,9 @@
           <w:rFonts w:ascii="Calibri" w:cs="Calibri" w:eastAsia="Calibri" w:hAnsi="Calibri"/>
           <w:b w:val="false"/>
           <w:bCs w:val="false"/>
-          <w:i w:val="false"/>
-          <w:iCs w:val="false"/>
-          <w:color w:val="42464B"/>
-          <w:sz w:val="19"/>
-          <w:szCs w:val="19"/>
+          <w:color w:val="4F545A"/>
+          <w:sz w:val="17"/>
+          <w:szCs w:val="17"/>
         </w:rPr>
         <w:t xml:space="preserve">     </w:t>
       </w:r>
@@ -1886,14 +1716,12 @@
           <w:rFonts w:ascii="Calibri" w:cs="Calibri" w:eastAsia="Calibri" w:hAnsi="Calibri"/>
           <w:b/>
           <w:bCs/>
-          <w:i w:val="false"/>
-          <w:iCs w:val="false"/>
-          <w:color w:val="0E0F11"/>
+          <w:color w:val="23272B"/>
           <w:spacing w:val="90"/>
-          <w:sz w:val="18"/>
-          <w:szCs w:val="18"/>
+          <w:sz w:val="16"/>
+          <w:szCs w:val="16"/>
         </w:rPr>
-        <w:t xml:space="preserve">CONSIDERACIONES IMPORTANTES</w:t>
+        <w:t xml:space="preserve">CONSIDERACIONES Y ACEPTACIÓN</w:t>
       </w:r>
     </w:p>
     <w:p>
@@ -1907,9 +1735,7 @@
           <w:rFonts w:ascii="Calibri" w:cs="Calibri" w:eastAsia="Calibri" w:hAnsi="Calibri"/>
           <w:b w:val="false"/>
           <w:bCs w:val="false"/>
-          <w:i w:val="false"/>
-          <w:iCs w:val="false"/>
-          <w:color w:val="42464B"/>
+          <w:color w:val="4F545A"/>
           <w:sz w:val="8"/>
           <w:szCs w:val="8"/>
         </w:rPr>
@@ -1918,7 +1744,7 @@
     </w:p>
     <w:tbl>
       <w:tblPr>
-        <w:tblW w:type="dxa" w:w="9072"/>
+        <w:tblW w:type="dxa" w:w="9504"/>
         <w:tblBorders>
           <w:top w:val="none"/>
           <w:left w:val="none"/>
@@ -1930,8 +1756,8 @@
         <w:tblLayout w:type="fixed"/>
       </w:tblPr>
       <w:tblGrid>
-        <w:gridCol w:w="700"/>
-        <w:gridCol w:w="8372"/>
+        <w:gridCol w:w="4752"/>
+        <w:gridCol w:w="4752"/>
       </w:tblGrid>
       <w:tr>
         <w:trPr>
@@ -1939,456 +1765,261 @@
         </w:trPr>
         <w:tc>
           <w:tcPr>
-            <w:tcW w:type="dxa" w:w="700"/>
-            <w:tcBorders>
-              <w:top w:val="none"/>
-              <w:left w:val="none"/>
-              <w:bottom w:val="single" w:color="E9E6E1" w:sz="4"/>
-              <w:right w:val="none"/>
-            </w:tcBorders>
-            <w:tcMar>
-              <w:top w:type="dxa" w:w="172"/>
+            <w:tcW w:type="dxa" w:w="4752"/>
+            <w:tcMar>
+              <w:top w:type="dxa" w:w="0"/>
               <w:left w:type="dxa" w:w="0"/>
-              <w:bottom w:type="dxa" w:w="172"/>
-              <w:right w:type="dxa" w:w="0"/>
-            </w:tcMar>
-          </w:tcPr>
-          <w:p>
-            <w:pPr>
-              <w:spacing w:after="0" w:before="0"/>
+              <w:bottom w:type="dxa" w:w="0"/>
+              <w:right w:type="dxa" w:w="420"/>
+            </w:tcMar>
+          </w:tcPr>
+          <w:p>
+            <w:pPr>
+              <w:spacing w:after="60" w:before="0" w:line="235" w:lineRule="auto"/>
+              <w:ind w:left="330" w:hanging="330"/>
+              <w:jc w:val="both"/>
             </w:pPr>
             <w:r>
               <w:rPr>
                 <w:rFonts w:ascii="Cambria" w:cs="Cambria" w:eastAsia="Cambria" w:hAnsi="Cambria"/>
                 <w:b/>
                 <w:bCs/>
-                <w:i w:val="false"/>
-                <w:iCs w:val="false"/>
-                <w:color w:val="C21112"/>
-                <w:spacing w:val="10"/>
-                <w:sz w:val="20"/>
-                <w:szCs w:val="20"/>
+                <w:color w:val="8A3B33"/>
+                <w:sz w:val="14"/>
+                <w:szCs w:val="14"/>
               </w:rPr>
               <w:t xml:space="preserve">01</w:t>
             </w:r>
-          </w:p>
-        </w:tc>
-        <w:tc>
-          <w:tcPr>
-            <w:tcW w:type="dxa" w:w="8372"/>
-            <w:tcBorders>
-              <w:top w:val="none"/>
-              <w:left w:val="none"/>
-              <w:bottom w:val="single" w:color="E9E6E1" w:sz="4"/>
-              <w:right w:val="none"/>
-            </w:tcBorders>
-            <w:tcMar>
-              <w:top w:type="dxa" w:w="172"/>
-              <w:left w:type="dxa" w:w="0"/>
-              <w:bottom w:type="dxa" w:w="172"/>
-              <w:right w:type="dxa" w:w="0"/>
-            </w:tcMar>
-          </w:tcPr>
-          <w:p>
-            <w:pPr>
-              <w:spacing w:after="0" w:before="0" w:line="285" w:lineRule="auto"/>
+            <w:r>
+              <w:rPr>
+                <w:rFonts w:ascii="Calibri" w:cs="Calibri" w:eastAsia="Calibri" w:hAnsi="Calibri"/>
+                <w:b w:val="false"/>
+                <w:bCs w:val="false"/>
+                <w:color w:val="4F545A"/>
+                <w:sz w:val="19"/>
+                <w:szCs w:val="19"/>
+              </w:rPr>
+              <w:t xml:space="preserve">	</w:t>
+            </w:r>
+            <w:r>
+              <w:rPr>
+                <w:rFonts w:ascii="Calibri" w:cs="Calibri" w:eastAsia="Calibri" w:hAnsi="Calibri"/>
+                <w:b w:val="false"/>
+                <w:bCs w:val="false"/>
+                <w:color w:val="4F545A"/>
+                <w:sz w:val="15"/>
+                <w:szCs w:val="15"/>
+              </w:rPr>
+              <w:t xml:space="preserve">La presente cotización se emite con base en las características de la mercancía proporcionadas por el cliente.</w:t>
+            </w:r>
+          </w:p>
+          <w:p>
+            <w:pPr>
+              <w:spacing w:after="60" w:before="0" w:line="235" w:lineRule="auto"/>
+              <w:ind w:left="330" w:hanging="330"/>
               <w:jc w:val="both"/>
-            </w:pPr>
-            <w:r>
-              <w:rPr>
-                <w:rFonts w:ascii="Calibri" w:cs="Calibri" w:eastAsia="Calibri" w:hAnsi="Calibri"/>
-                <w:b w:val="false"/>
-                <w:bCs w:val="false"/>
-                <w:i w:val="false"/>
-                <w:iCs w:val="false"/>
-                <w:color w:val="42464B"/>
-                <w:sz w:val="20"/>
-                <w:szCs w:val="20"/>
-              </w:rPr>
-              <w:t xml:space="preserve">La presente cotización se emite con base en las características de la mercancía proporcionadas por el cliente.</w:t>
-            </w:r>
-          </w:p>
-        </w:tc>
-      </w:tr>
-      <w:tr>
-        <w:trPr>
-          <w:cantSplit/>
-        </w:trPr>
-        <w:tc>
-          <w:tcPr>
-            <w:tcW w:type="dxa" w:w="700"/>
-            <w:tcBorders>
-              <w:top w:val="none"/>
-              <w:left w:val="none"/>
-              <w:bottom w:val="single" w:color="E9E6E1" w:sz="4"/>
-              <w:right w:val="none"/>
-            </w:tcBorders>
-            <w:tcMar>
-              <w:top w:type="dxa" w:w="172"/>
-              <w:left w:type="dxa" w:w="0"/>
-              <w:bottom w:type="dxa" w:w="172"/>
-              <w:right w:type="dxa" w:w="0"/>
-            </w:tcMar>
-          </w:tcPr>
-          <w:p>
-            <w:pPr>
-              <w:spacing w:after="0" w:before="0"/>
             </w:pPr>
             <w:r>
               <w:rPr>
                 <w:rFonts w:ascii="Cambria" w:cs="Cambria" w:eastAsia="Cambria" w:hAnsi="Cambria"/>
                 <w:b/>
                 <w:bCs/>
-                <w:i w:val="false"/>
-                <w:iCs w:val="false"/>
-                <w:color w:val="C21112"/>
-                <w:spacing w:val="10"/>
-                <w:sz w:val="20"/>
-                <w:szCs w:val="20"/>
+                <w:color w:val="8A3B33"/>
+                <w:sz w:val="14"/>
+                <w:szCs w:val="14"/>
               </w:rPr>
               <w:t xml:space="preserve">02</w:t>
             </w:r>
-          </w:p>
-        </w:tc>
-        <w:tc>
-          <w:tcPr>
-            <w:tcW w:type="dxa" w:w="8372"/>
-            <w:tcBorders>
-              <w:top w:val="none"/>
-              <w:left w:val="none"/>
-              <w:bottom w:val="single" w:color="E9E6E1" w:sz="4"/>
-              <w:right w:val="none"/>
-            </w:tcBorders>
-            <w:tcMar>
-              <w:top w:type="dxa" w:w="172"/>
-              <w:left w:type="dxa" w:w="0"/>
-              <w:bottom w:type="dxa" w:w="172"/>
-              <w:right w:type="dxa" w:w="0"/>
-            </w:tcMar>
-          </w:tcPr>
-          <w:p>
-            <w:pPr>
-              <w:spacing w:after="0" w:before="0" w:line="285" w:lineRule="auto"/>
+            <w:r>
+              <w:rPr>
+                <w:rFonts w:ascii="Calibri" w:cs="Calibri" w:eastAsia="Calibri" w:hAnsi="Calibri"/>
+                <w:b w:val="false"/>
+                <w:bCs w:val="false"/>
+                <w:color w:val="4F545A"/>
+                <w:sz w:val="19"/>
+                <w:szCs w:val="19"/>
+              </w:rPr>
+              <w:t xml:space="preserve">	</w:t>
+            </w:r>
+            <w:r>
+              <w:rPr>
+                <w:rFonts w:ascii="Calibri" w:cs="Calibri" w:eastAsia="Calibri" w:hAnsi="Calibri"/>
+                <w:b w:val="false"/>
+                <w:bCs w:val="false"/>
+                <w:color w:val="4F545A"/>
+                <w:sz w:val="15"/>
+                <w:szCs w:val="15"/>
+              </w:rPr>
+              <w:t xml:space="preserve">Todos los importes indicados son más IVA.</w:t>
+            </w:r>
+          </w:p>
+          <w:p>
+            <w:pPr>
+              <w:spacing w:after="60" w:before="0" w:line="235" w:lineRule="auto"/>
+              <w:ind w:left="330" w:hanging="330"/>
               <w:jc w:val="both"/>
-            </w:pPr>
-            <w:r>
-              <w:rPr>
-                <w:rFonts w:ascii="Calibri" w:cs="Calibri" w:eastAsia="Calibri" w:hAnsi="Calibri"/>
-                <w:b w:val="false"/>
-                <w:bCs w:val="false"/>
-                <w:i w:val="false"/>
-                <w:iCs w:val="false"/>
-                <w:color w:val="42464B"/>
-                <w:sz w:val="20"/>
-                <w:szCs w:val="20"/>
-              </w:rPr>
-              <w:t xml:space="preserve">Todos los importes indicados son más IVA.</w:t>
-            </w:r>
-          </w:p>
-        </w:tc>
-      </w:tr>
-      <w:tr>
-        <w:trPr>
-          <w:cantSplit/>
-        </w:trPr>
-        <w:tc>
-          <w:tcPr>
-            <w:tcW w:type="dxa" w:w="700"/>
-            <w:tcBorders>
-              <w:top w:val="none"/>
-              <w:left w:val="none"/>
-              <w:bottom w:val="single" w:color="E9E6E1" w:sz="4"/>
-              <w:right w:val="none"/>
-            </w:tcBorders>
-            <w:tcMar>
-              <w:top w:type="dxa" w:w="172"/>
-              <w:left w:type="dxa" w:w="0"/>
-              <w:bottom w:type="dxa" w:w="172"/>
-              <w:right w:type="dxa" w:w="0"/>
-            </w:tcMar>
-          </w:tcPr>
-          <w:p>
-            <w:pPr>
-              <w:spacing w:after="0" w:before="0"/>
             </w:pPr>
             <w:r>
               <w:rPr>
                 <w:rFonts w:ascii="Cambria" w:cs="Cambria" w:eastAsia="Cambria" w:hAnsi="Cambria"/>
                 <w:b/>
                 <w:bCs/>
-                <w:i w:val="false"/>
-                <w:iCs w:val="false"/>
-                <w:color w:val="C21112"/>
-                <w:spacing w:val="10"/>
-                <w:sz w:val="20"/>
-                <w:szCs w:val="20"/>
+                <w:color w:val="8A3B33"/>
+                <w:sz w:val="14"/>
+                <w:szCs w:val="14"/>
               </w:rPr>
               <w:t xml:space="preserve">03</w:t>
             </w:r>
-          </w:p>
-        </w:tc>
-        <w:tc>
-          <w:tcPr>
-            <w:tcW w:type="dxa" w:w="8372"/>
-            <w:tcBorders>
-              <w:top w:val="none"/>
-              <w:left w:val="none"/>
-              <w:bottom w:val="single" w:color="E9E6E1" w:sz="4"/>
-              <w:right w:val="none"/>
-            </w:tcBorders>
-            <w:tcMar>
-              <w:top w:type="dxa" w:w="172"/>
-              <w:left w:type="dxa" w:w="0"/>
-              <w:bottom w:type="dxa" w:w="172"/>
-              <w:right w:type="dxa" w:w="0"/>
-            </w:tcMar>
-          </w:tcPr>
-          <w:p>
-            <w:pPr>
-              <w:spacing w:after="0" w:before="0" w:line="285" w:lineRule="auto"/>
+            <w:r>
+              <w:rPr>
+                <w:rFonts w:ascii="Calibri" w:cs="Calibri" w:eastAsia="Calibri" w:hAnsi="Calibri"/>
+                <w:b w:val="false"/>
+                <w:bCs w:val="false"/>
+                <w:color w:val="4F545A"/>
+                <w:sz w:val="19"/>
+                <w:szCs w:val="19"/>
+              </w:rPr>
+              <w:t xml:space="preserve">	</w:t>
+            </w:r>
+            <w:r>
+              <w:rPr>
+                <w:rFonts w:ascii="Calibri" w:cs="Calibri" w:eastAsia="Calibri" w:hAnsi="Calibri"/>
+                <w:b w:val="false"/>
+                <w:bCs w:val="false"/>
+                <w:color w:val="4F545A"/>
+                <w:sz w:val="15"/>
+                <w:szCs w:val="15"/>
+              </w:rPr>
+              <w:t xml:space="preserve">Los precios están sujetos a validación del peso, dimensiones y condiciones reales de la mercancía al momento de la recolección.</w:t>
+            </w:r>
+          </w:p>
+          <w:p>
+            <w:pPr>
+              <w:spacing w:after="60" w:before="0" w:line="235" w:lineRule="auto"/>
+              <w:ind w:left="330" w:hanging="330"/>
               <w:jc w:val="both"/>
-            </w:pPr>
-            <w:r>
-              <w:rPr>
-                <w:rFonts w:ascii="Calibri" w:cs="Calibri" w:eastAsia="Calibri" w:hAnsi="Calibri"/>
-                <w:b w:val="false"/>
-                <w:bCs w:val="false"/>
-                <w:i w:val="false"/>
-                <w:iCs w:val="false"/>
-                <w:color w:val="42464B"/>
-                <w:sz w:val="20"/>
-                <w:szCs w:val="20"/>
-              </w:rPr>
-              <w:t xml:space="preserve">Los precios están sujetos a validación del peso, dimensiones y condiciones reales de la mercancía al momento de la recolección.</w:t>
-            </w:r>
-          </w:p>
-        </w:tc>
-      </w:tr>
-      <w:tr>
-        <w:trPr>
-          <w:cantSplit/>
-        </w:trPr>
-        <w:tc>
-          <w:tcPr>
-            <w:tcW w:type="dxa" w:w="700"/>
-            <w:tcBorders>
-              <w:top w:val="none"/>
-              <w:left w:val="none"/>
-              <w:bottom w:val="single" w:color="E9E6E1" w:sz="4"/>
-              <w:right w:val="none"/>
-            </w:tcBorders>
-            <w:tcMar>
-              <w:top w:type="dxa" w:w="172"/>
-              <w:left w:type="dxa" w:w="0"/>
-              <w:bottom w:type="dxa" w:w="172"/>
-              <w:right w:type="dxa" w:w="0"/>
-            </w:tcMar>
-          </w:tcPr>
-          <w:p>
-            <w:pPr>
-              <w:spacing w:after="0" w:before="0"/>
             </w:pPr>
             <w:r>
               <w:rPr>
                 <w:rFonts w:ascii="Cambria" w:cs="Cambria" w:eastAsia="Cambria" w:hAnsi="Cambria"/>
                 <w:b/>
                 <w:bCs/>
-                <w:i w:val="false"/>
-                <w:iCs w:val="false"/>
-                <w:color w:val="C21112"/>
-                <w:spacing w:val="10"/>
-                <w:sz w:val="20"/>
-                <w:szCs w:val="20"/>
+                <w:color w:val="8A3B33"/>
+                <w:sz w:val="14"/>
+                <w:szCs w:val="14"/>
               </w:rPr>
               <w:t xml:space="preserve">04</w:t>
             </w:r>
-          </w:p>
-        </w:tc>
-        <w:tc>
-          <w:tcPr>
-            <w:tcW w:type="dxa" w:w="8372"/>
-            <w:tcBorders>
-              <w:top w:val="none"/>
-              <w:left w:val="none"/>
-              <w:bottom w:val="single" w:color="E9E6E1" w:sz="4"/>
-              <w:right w:val="none"/>
-            </w:tcBorders>
-            <w:tcMar>
-              <w:top w:type="dxa" w:w="172"/>
+            <w:r>
+              <w:rPr>
+                <w:rFonts w:ascii="Calibri" w:cs="Calibri" w:eastAsia="Calibri" w:hAnsi="Calibri"/>
+                <w:b w:val="false"/>
+                <w:bCs w:val="false"/>
+                <w:color w:val="4F545A"/>
+                <w:sz w:val="19"/>
+                <w:szCs w:val="19"/>
+              </w:rPr>
+              <w:t xml:space="preserve">	</w:t>
+            </w:r>
+            <w:r>
+              <w:rPr>
+                <w:rFonts w:ascii="Calibri" w:cs="Calibri" w:eastAsia="Calibri" w:hAnsi="Calibri"/>
+                <w:b w:val="false"/>
+                <w:bCs w:val="false"/>
+                <w:color w:val="4F545A"/>
+                <w:sz w:val="15"/>
+                <w:szCs w:val="15"/>
+              </w:rPr>
+              <w:t xml:space="preserve">El seguro de mercancía es opcional. En caso de requerir que el embarque viaje asegurado por Fletes Tauro, el costo será de $8.00 por cada millar del valor comercial declarado de la mercancía.</w:t>
+            </w:r>
+          </w:p>
+        </w:tc>
+        <w:tc>
+          <w:tcPr>
+            <w:tcW w:type="dxa" w:w="4752"/>
+            <w:tcMar>
+              <w:top w:type="dxa" w:w="0"/>
               <w:left w:type="dxa" w:w="0"/>
-              <w:bottom w:type="dxa" w:w="172"/>
+              <w:bottom w:type="dxa" w:w="0"/>
               <w:right w:type="dxa" w:w="0"/>
             </w:tcMar>
           </w:tcPr>
           <w:p>
             <w:pPr>
-              <w:spacing w:after="0" w:before="0" w:line="285" w:lineRule="auto"/>
+              <w:spacing w:after="60" w:before="0" w:line="235" w:lineRule="auto"/>
+              <w:ind w:left="330" w:hanging="330"/>
               <w:jc w:val="both"/>
-            </w:pPr>
-            <w:r>
-              <w:rPr>
-                <w:rFonts w:ascii="Calibri" w:cs="Calibri" w:eastAsia="Calibri" w:hAnsi="Calibri"/>
-                <w:b w:val="false"/>
-                <w:bCs w:val="false"/>
-                <w:i w:val="false"/>
-                <w:iCs w:val="false"/>
-                <w:color w:val="42464B"/>
-                <w:sz w:val="20"/>
-                <w:szCs w:val="20"/>
-              </w:rPr>
-              <w:t xml:space="preserve">El seguro de mercancía es opcional. En caso de requerir que el embarque viaje asegurado por Fletes Tauro, el costo será de $8.00 por cada millar del valor comercial declarado de la mercancía.</w:t>
-            </w:r>
-          </w:p>
-        </w:tc>
-      </w:tr>
-      <w:tr>
-        <w:trPr>
-          <w:cantSplit/>
-        </w:trPr>
-        <w:tc>
-          <w:tcPr>
-            <w:tcW w:type="dxa" w:w="700"/>
-            <w:tcBorders>
-              <w:top w:val="none"/>
-              <w:left w:val="none"/>
-              <w:bottom w:val="single" w:color="E9E6E1" w:sz="4"/>
-              <w:right w:val="none"/>
-            </w:tcBorders>
-            <w:tcMar>
-              <w:top w:type="dxa" w:w="172"/>
-              <w:left w:type="dxa" w:w="0"/>
-              <w:bottom w:type="dxa" w:w="172"/>
-              <w:right w:type="dxa" w:w="0"/>
-            </w:tcMar>
-          </w:tcPr>
-          <w:p>
-            <w:pPr>
-              <w:spacing w:after="0" w:before="0"/>
             </w:pPr>
             <w:r>
               <w:rPr>
                 <w:rFonts w:ascii="Cambria" w:cs="Cambria" w:eastAsia="Cambria" w:hAnsi="Cambria"/>
                 <w:b/>
                 <w:bCs/>
-                <w:i w:val="false"/>
-                <w:iCs w:val="false"/>
-                <w:color w:val="C21112"/>
-                <w:spacing w:val="10"/>
-                <w:sz w:val="20"/>
-                <w:szCs w:val="20"/>
+                <w:color w:val="8A3B33"/>
+                <w:sz w:val="14"/>
+                <w:szCs w:val="14"/>
               </w:rPr>
               <w:t xml:space="preserve">05</w:t>
             </w:r>
-          </w:p>
-        </w:tc>
-        <w:tc>
-          <w:tcPr>
-            <w:tcW w:type="dxa" w:w="8372"/>
-            <w:tcBorders>
-              <w:top w:val="none"/>
-              <w:left w:val="none"/>
-              <w:bottom w:val="single" w:color="E9E6E1" w:sz="4"/>
-              <w:right w:val="none"/>
-            </w:tcBorders>
-            <w:tcMar>
-              <w:top w:type="dxa" w:w="172"/>
-              <w:left w:type="dxa" w:w="0"/>
-              <w:bottom w:type="dxa" w:w="172"/>
-              <w:right w:type="dxa" w:w="0"/>
-            </w:tcMar>
-          </w:tcPr>
-          <w:p>
-            <w:pPr>
-              <w:spacing w:after="0" w:before="0" w:line="285" w:lineRule="auto"/>
+            <w:r>
+              <w:rPr>
+                <w:rFonts w:ascii="Calibri" w:cs="Calibri" w:eastAsia="Calibri" w:hAnsi="Calibri"/>
+                <w:b w:val="false"/>
+                <w:bCs w:val="false"/>
+                <w:color w:val="4F545A"/>
+                <w:sz w:val="19"/>
+                <w:szCs w:val="19"/>
+              </w:rPr>
+              <w:t xml:space="preserve">	</w:t>
+            </w:r>
+            <w:r>
+              <w:rPr>
+                <w:rFonts w:ascii="Calibri" w:cs="Calibri" w:eastAsia="Calibri" w:hAnsi="Calibri"/>
+                <w:b w:val="false"/>
+                <w:bCs w:val="false"/>
+                <w:color w:val="4F545A"/>
+                <w:sz w:val="15"/>
+                <w:szCs w:val="15"/>
+              </w:rPr>
+              <w:t xml:space="preserve">La cotización no incluye servicios adicionales como maniobras, almacenajes, reexpediciones, citas de entrega (las cuales deberán solicitarse con un mínimo de 48 horas de anticipación) ni cualquier otro concepto extraordinario que pudiera generarse durante la operación.</w:t>
+            </w:r>
+          </w:p>
+          <w:p>
+            <w:pPr>
+              <w:spacing w:after="60" w:before="0" w:line="235" w:lineRule="auto"/>
+              <w:ind w:left="330" w:hanging="330"/>
               <w:jc w:val="both"/>
-            </w:pPr>
-            <w:r>
-              <w:rPr>
-                <w:rFonts w:ascii="Calibri" w:cs="Calibri" w:eastAsia="Calibri" w:hAnsi="Calibri"/>
-                <w:b w:val="false"/>
-                <w:bCs w:val="false"/>
-                <w:i w:val="false"/>
-                <w:iCs w:val="false"/>
-                <w:color w:val="42464B"/>
-                <w:sz w:val="20"/>
-                <w:szCs w:val="20"/>
-              </w:rPr>
-              <w:t xml:space="preserve">La cotización no incluye servicios adicionales como maniobras, almacenajes, reexpediciones, citas de entrega (las cuales deberán solicitarse con un mínimo de 48 horas de anticipación) ni cualquier otro concepto extraordinario que pudiera generarse durante la operación.</w:t>
-            </w:r>
-          </w:p>
-        </w:tc>
-      </w:tr>
-      <w:tr>
-        <w:trPr>
-          <w:cantSplit/>
-        </w:trPr>
-        <w:tc>
-          <w:tcPr>
-            <w:tcW w:type="dxa" w:w="700"/>
-            <w:tcBorders>
-              <w:top w:val="none"/>
-              <w:left w:val="none"/>
-              <w:bottom w:val="none"/>
-              <w:right w:val="none"/>
-            </w:tcBorders>
-            <w:tcMar>
-              <w:top w:type="dxa" w:w="172"/>
-              <w:left w:type="dxa" w:w="0"/>
-              <w:bottom w:type="dxa" w:w="172"/>
-              <w:right w:type="dxa" w:w="0"/>
-            </w:tcMar>
-          </w:tcPr>
-          <w:p>
-            <w:pPr>
-              <w:spacing w:after="0" w:before="0"/>
             </w:pPr>
             <w:r>
               <w:rPr>
                 <w:rFonts w:ascii="Cambria" w:cs="Cambria" w:eastAsia="Cambria" w:hAnsi="Cambria"/>
                 <w:b/>
                 <w:bCs/>
-                <w:i w:val="false"/>
-                <w:iCs w:val="false"/>
-                <w:color w:val="C21112"/>
-                <w:spacing w:val="10"/>
-                <w:sz w:val="20"/>
-                <w:szCs w:val="20"/>
+                <w:color w:val="8A3B33"/>
+                <w:sz w:val="14"/>
+                <w:szCs w:val="14"/>
               </w:rPr>
               <w:t xml:space="preserve">06</w:t>
             </w:r>
-          </w:p>
-        </w:tc>
-        <w:tc>
-          <w:tcPr>
-            <w:tcW w:type="dxa" w:w="8372"/>
-            <w:tcBorders>
-              <w:top w:val="none"/>
-              <w:left w:val="none"/>
-              <w:bottom w:val="none"/>
-              <w:right w:val="none"/>
-            </w:tcBorders>
-            <w:tcMar>
-              <w:top w:type="dxa" w:w="172"/>
-              <w:left w:type="dxa" w:w="0"/>
-              <w:bottom w:type="dxa" w:w="172"/>
-              <w:right w:type="dxa" w:w="0"/>
-            </w:tcMar>
-          </w:tcPr>
-          <w:p>
-            <w:pPr>
-              <w:spacing w:after="0" w:before="0" w:line="285" w:lineRule="auto"/>
-              <w:jc w:val="both"/>
-            </w:pPr>
-            <w:r>
-              <w:rPr>
-                <w:rFonts w:ascii="Calibri" w:cs="Calibri" w:eastAsia="Calibri" w:hAnsi="Calibri"/>
-                <w:b w:val="false"/>
-                <w:bCs w:val="false"/>
-                <w:i w:val="false"/>
-                <w:iCs w:val="false"/>
-                <w:color w:val="42464B"/>
-                <w:sz w:val="20"/>
-                <w:szCs w:val="20"/>
+            <w:r>
+              <w:rPr>
+                <w:rFonts w:ascii="Calibri" w:cs="Calibri" w:eastAsia="Calibri" w:hAnsi="Calibri"/>
+                <w:b w:val="false"/>
+                <w:bCs w:val="false"/>
+                <w:color w:val="4F545A"/>
+                <w:sz w:val="19"/>
+                <w:szCs w:val="19"/>
+              </w:rPr>
+              <w:t xml:space="preserve">	</w:t>
+            </w:r>
+            <w:r>
+              <w:rPr>
+                <w:rFonts w:ascii="Calibri" w:cs="Calibri" w:eastAsia="Calibri" w:hAnsi="Calibri"/>
+                <w:b w:val="false"/>
+                <w:bCs w:val="false"/>
+                <w:color w:val="4F545A"/>
+                <w:sz w:val="15"/>
+                <w:szCs w:val="15"/>
               </w:rPr>
               <w:t xml:space="preserve">Para las recolecciones y entregas locales se utilizan unidades tipo rabón, mientras que el traslado entre Monterrey y Ciudad de México se realiza en tráiler con caja seca de 48 o 53 pies, de acuerdo con la disponibilidad operativa.</w:t>
             </w:r>
@@ -2398,59 +2029,6 @@
     </w:tbl>
     <w:p>
       <w:pPr>
-        <w:keepNext/>
-        <w:keepLines/>
-        <w:pBdr>
-          <w:bottom w:val="single" w:color="D6D3CE" w:sz="4"/>
-        </w:pBdr>
-        <w:spacing w:after="110" w:before="270"/>
-      </w:pPr>
-      <w:r>
-        <w:rPr>
-          <w:rFonts w:ascii="Cambria" w:cs="Cambria" w:eastAsia="Cambria" w:hAnsi="Cambria"/>
-          <w:b/>
-          <w:bCs/>
-          <w:i w:val="false"/>
-          <w:iCs w:val="false"/>
-          <w:color w:val="C21112"/>
-          <w:spacing w:val="10"/>
-          <w:sz w:val="19"/>
-          <w:szCs w:val="19"/>
-        </w:rPr>
-        <w:t xml:space="preserve">04</w:t>
-      </w:r>
-      <w:r>
-        <w:rPr>
-          <w:rFonts w:ascii="Calibri" w:cs="Calibri" w:eastAsia="Calibri" w:hAnsi="Calibri"/>
-          <w:b w:val="false"/>
-          <w:bCs w:val="false"/>
-          <w:i w:val="false"/>
-          <w:iCs w:val="false"/>
-          <w:color w:val="42464B"/>
-          <w:sz w:val="19"/>
-          <w:szCs w:val="19"/>
-        </w:rPr>
-        <w:t xml:space="preserve">     </w:t>
-      </w:r>
-      <w:r>
-        <w:rPr>
-          <w:rFonts w:ascii="Calibri" w:cs="Calibri" w:eastAsia="Calibri" w:hAnsi="Calibri"/>
-          <w:b/>
-          <w:bCs/>
-          <w:i w:val="false"/>
-          <w:iCs w:val="false"/>
-          <w:color w:val="0E0F11"/>
-          <w:spacing w:val="90"/>
-          <w:sz w:val="18"/>
-          <w:szCs w:val="18"/>
-        </w:rPr>
-        <w:t xml:space="preserve">VIGENCIA Y ACEPTACIÓN</w:t>
-      </w:r>
-    </w:p>
-    <w:p>
-      <w:pPr>
-        <w:keepNext/>
-        <w:keepLines/>
         <w:spacing w:after="0" w:before="0"/>
       </w:pPr>
       <w:r>
@@ -2458,51 +2036,27 @@
           <w:rFonts w:ascii="Calibri" w:cs="Calibri" w:eastAsia="Calibri" w:hAnsi="Calibri"/>
           <w:b w:val="false"/>
           <w:bCs w:val="false"/>
-          <w:i w:val="false"/>
-          <w:iCs w:val="false"/>
-          <w:color w:val="42464B"/>
-          <w:sz w:val="8"/>
-          <w:szCs w:val="8"/>
+          <w:color w:val="4F545A"/>
+          <w:sz w:val="6"/>
+          <w:szCs w:val="6"/>
         </w:rPr>
         <w:t xml:space="preserve"/>
       </w:r>
     </w:p>
     <w:p>
       <w:pPr>
-        <w:spacing w:after="130" w:before="0" w:line="276" w:lineRule="auto"/>
-        <w:jc w:val="both"/>
+        <w:spacing w:after="0" w:before="0" w:line="245" w:lineRule="auto"/>
       </w:pPr>
       <w:r>
         <w:rPr>
           <w:rFonts w:ascii="Calibri" w:cs="Calibri" w:eastAsia="Calibri" w:hAnsi="Calibri"/>
           <w:b w:val="false"/>
           <w:bCs w:val="false"/>
-          <w:i w:val="false"/>
-          <w:iCs w:val="false"/>
-          <w:color w:val="42464B"/>
-          <w:sz w:val="21"/>
-          <w:szCs w:val="21"/>
+          <w:color w:val="4F545A"/>
+          <w:sz w:val="15"/>
+          <w:szCs w:val="15"/>
         </w:rPr>
-        <w:t xml:space="preserve">Esta cotización tiene una vigencia de 15 días naturales a partir de la fecha de emisión. Para confirmar el servicio basta con devolver este documento firmado o enviar su aceptación por correo electrónico al ejecutivo de cuenta.</w:t>
-      </w:r>
-    </w:p>
-    <w:p>
-      <w:pPr>
-        <w:spacing w:after="0" w:before="0" w:line="276" w:lineRule="auto"/>
-        <w:jc w:val="both"/>
-      </w:pPr>
-      <w:r>
-        <w:rPr>
-          <w:rFonts w:ascii="Calibri" w:cs="Calibri" w:eastAsia="Calibri" w:hAnsi="Calibri"/>
-          <w:b w:val="false"/>
-          <w:bCs w:val="false"/>
-          <w:i w:val="false"/>
-          <w:iCs w:val="false"/>
-          <w:color w:val="42464B"/>
-          <w:sz w:val="21"/>
-          <w:szCs w:val="21"/>
-        </w:rPr>
-        <w:t xml:space="preserve">Quedamos a sus órdenes para cualquier aclaración y agradecemos la confianza depositada en Fletes Tauro.</w:t>
+        <w:t xml:space="preserve">Para confirmar el servicio, devuelva este documento firmado o envíe su aceptación por correo al ejecutivo de cuenta.</w:t>
       </w:r>
     </w:p>
     <w:p>
@@ -2514,18 +2068,16 @@
           <w:rFonts w:ascii="Calibri" w:cs="Calibri" w:eastAsia="Calibri" w:hAnsi="Calibri"/>
           <w:b w:val="false"/>
           <w:bCs w:val="false"/>
-          <w:i w:val="false"/>
-          <w:iCs w:val="false"/>
-          <w:color w:val="42464B"/>
-          <w:sz w:val="46"/>
-          <w:szCs w:val="46"/>
+          <w:color w:val="4F545A"/>
+          <w:sz w:val="4"/>
+          <w:szCs w:val="4"/>
         </w:rPr>
         <w:t xml:space="preserve"/>
       </w:r>
     </w:p>
     <w:tbl>
       <w:tblPr>
-        <w:tblW w:type="dxa" w:w="9072"/>
+        <w:tblW w:type="dxa" w:w="9504"/>
         <w:tblBorders>
           <w:top w:val="none"/>
           <w:left w:val="none"/>
@@ -2537,9 +2089,9 @@
         <w:tblLayout w:type="fixed"/>
       </w:tblPr>
       <w:tblGrid>
-        <w:gridCol w:w="4116"/>
-        <w:gridCol w:w="840"/>
-        <w:gridCol w:w="4116"/>
+        <w:gridCol w:w="4552"/>
+        <w:gridCol w:w="400"/>
+        <w:gridCol w:w="4552"/>
       </w:tblGrid>
       <w:tr>
         <w:trPr>
@@ -2547,7 +2099,7 @@
         </w:trPr>
         <w:tc>
           <w:tcPr>
-            <w:tcW w:type="dxa" w:w="4116"/>
+            <w:tcW w:type="dxa" w:w="4552"/>
             <w:tcMar>
               <w:top w:type="dxa" w:w="0"/>
               <w:left w:type="dxa" w:w="0"/>
@@ -2562,107 +2114,69 @@
             <w:r>
               <w:rPr>
                 <w:rFonts w:ascii="Calibri" w:cs="Calibri" w:eastAsia="Calibri" w:hAnsi="Calibri"/>
+                <w:b w:val="false"/>
+                <w:bCs w:val="false"/>
+                <w:color w:val="4F545A"/>
+                <w:sz w:val="30"/>
+                <w:szCs w:val="30"/>
+              </w:rPr>
+              <w:t xml:space="preserve"/>
+            </w:r>
+          </w:p>
+          <w:p>
+            <w:pPr>
+              <w:pBdr>
+                <w:top w:val="single" w:color="D9D3C9" w:sz="6"/>
+              </w:pBdr>
+              <w:spacing w:after="45" w:before="55"/>
+            </w:pPr>
+            <w:r>
+              <w:rPr>
+                <w:rFonts w:ascii="Calibri" w:cs="Calibri" w:eastAsia="Calibri" w:hAnsi="Calibri"/>
+                <w:b w:val="false"/>
+                <w:bCs w:val="false"/>
+                <w:color w:val="4F545A"/>
+                <w:sz w:val="6"/>
+                <w:szCs w:val="6"/>
+              </w:rPr>
+              <w:t xml:space="preserve"/>
+            </w:r>
+          </w:p>
+          <w:p>
+            <w:pPr>
+              <w:spacing w:after="0" w:before="0"/>
+            </w:pPr>
+            <w:r>
+              <w:rPr>
+                <w:rFonts w:ascii="Calibri" w:cs="Calibri" w:eastAsia="Calibri" w:hAnsi="Calibri"/>
                 <w:b/>
                 <w:bCs/>
-                <w:i w:val="false"/>
-                <w:iCs w:val="false"/>
-                <w:color w:val="7C818A"/>
-                <w:spacing w:val="80"/>
+                <w:color w:val="23272B"/>
+                <w:spacing w:val="60"/>
+                <w:sz w:val="12"/>
+                <w:szCs w:val="12"/>
+              </w:rPr>
+              <w:t xml:space="preserve">POR FLETES TAURO</w:t>
+            </w:r>
+            <w:r>
+              <w:rPr>
+                <w:rFonts w:ascii="Calibri" w:cs="Calibri" w:eastAsia="Calibri" w:hAnsi="Calibri"/>
+                <w:b w:val="false"/>
+                <w:bCs w:val="false"/>
+                <w:color w:val="767369"/>
                 <w:sz w:val="13"/>
                 <w:szCs w:val="13"/>
               </w:rPr>
-              <w:t xml:space="preserve">POR FLETES TAURO</w:t>
-            </w:r>
-          </w:p>
-          <w:p>
-            <w:pPr>
-              <w:spacing w:after="0" w:before="0"/>
-            </w:pPr>
-            <w:r>
-              <w:rPr>
-                <w:rFonts w:ascii="Calibri" w:cs="Calibri" w:eastAsia="Calibri" w:hAnsi="Calibri"/>
-                <w:b w:val="false"/>
-                <w:bCs w:val="false"/>
-                <w:i w:val="false"/>
-                <w:iCs w:val="false"/>
-                <w:color w:val="42464B"/>
-                <w:sz w:val="34"/>
-                <w:szCs w:val="34"/>
-              </w:rPr>
-              <w:t xml:space="preserve"/>
-            </w:r>
-          </w:p>
-          <w:p>
-            <w:pPr>
-              <w:spacing w:after="0" w:before="0"/>
-            </w:pPr>
-            <w:r>
-              <w:rPr>
-                <w:rFonts w:ascii="Calibri" w:cs="Calibri" w:eastAsia="Calibri" w:hAnsi="Calibri"/>
-                <w:b w:val="false"/>
-                <w:bCs w:val="false"/>
-                <w:i w:val="false"/>
-                <w:iCs w:val="false"/>
-                <w:color w:val="42464B"/>
-                <w:sz w:val="34"/>
-                <w:szCs w:val="34"/>
-              </w:rPr>
-              <w:t xml:space="preserve"/>
-            </w:r>
-          </w:p>
-          <w:p>
-            <w:pPr>
-              <w:spacing w:after="0" w:before="0"/>
-            </w:pPr>
-            <w:r>
-              <w:rPr>
-                <w:rFonts w:ascii="Calibri" w:cs="Calibri" w:eastAsia="Calibri" w:hAnsi="Calibri"/>
-                <w:b w:val="false"/>
-                <w:bCs w:val="false"/>
-                <w:i w:val="false"/>
-                <w:iCs w:val="false"/>
-                <w:color w:val="42464B"/>
-                <w:sz w:val="34"/>
-                <w:szCs w:val="34"/>
-              </w:rPr>
-              <w:t xml:space="preserve"/>
-            </w:r>
-          </w:p>
-          <w:p>
-            <w:pPr>
-              <w:pBdr>
-                <w:top w:val="single" w:color="D6D3CE" w:sz="6"/>
-              </w:pBdr>
-              <w:spacing w:after="60" w:before="80"/>
-            </w:pPr>
-            <w:r>
-              <w:rPr>
-                <w:rFonts w:ascii="Calibri" w:cs="Calibri" w:eastAsia="Calibri" w:hAnsi="Calibri"/>
-                <w:b w:val="false"/>
-                <w:bCs w:val="false"/>
-                <w:i w:val="false"/>
-                <w:iCs w:val="false"/>
-                <w:color w:val="42464B"/>
-                <w:sz w:val="6"/>
-                <w:szCs w:val="6"/>
-              </w:rPr>
-              <w:t xml:space="preserve"/>
-            </w:r>
-          </w:p>
-          <w:p>
-            <w:pPr>
-              <w:spacing w:after="0" w:before="0"/>
-            </w:pPr>
-            <w:r>
-              <w:rPr>
-                <w:rFonts w:ascii="Calibri" w:cs="Calibri" w:eastAsia="Calibri" w:hAnsi="Calibri"/>
-                <w:b w:val="false"/>
-                <w:bCs w:val="false"/>
-                <w:i w:val="false"/>
-                <w:iCs w:val="false"/>
-                <w:color w:val="7C818A"/>
-                <w:sz w:val="16"/>
-                <w:szCs w:val="16"/>
+              <w:t xml:space="preserve">   ·   </w:t>
+            </w:r>
+            <w:r>
+              <w:rPr>
+                <w:rFonts w:ascii="Calibri" w:cs="Calibri" w:eastAsia="Calibri" w:hAnsi="Calibri"/>
+                <w:b w:val="false"/>
+                <w:bCs w:val="false"/>
+                <w:color w:val="767369"/>
+                <w:sz w:val="14"/>
+                <w:szCs w:val="14"/>
               </w:rPr>
               <w:t xml:space="preserve">Nombre, firma y puesto</w:t>
             </w:r>
@@ -2670,7 +2184,7 @@
         </w:tc>
         <w:tc>
           <w:tcPr>
-            <w:tcW w:type="dxa" w:w="840"/>
+            <w:tcW w:type="dxa" w:w="400"/>
             <w:tcMar>
               <w:top w:type="dxa" w:w="0"/>
               <w:left w:type="dxa" w:w="0"/>
@@ -2687,9 +2201,7 @@
                 <w:rFonts w:ascii="Calibri" w:cs="Calibri" w:eastAsia="Calibri" w:hAnsi="Calibri"/>
                 <w:b w:val="false"/>
                 <w:bCs w:val="false"/>
-                <w:i w:val="false"/>
-                <w:iCs w:val="false"/>
-                <w:color w:val="42464B"/>
+                <w:color w:val="4F545A"/>
                 <w:sz w:val="2"/>
                 <w:szCs w:val="2"/>
               </w:rPr>
@@ -2699,7 +2211,7 @@
         </w:tc>
         <w:tc>
           <w:tcPr>
-            <w:tcW w:type="dxa" w:w="4116"/>
+            <w:tcW w:type="dxa" w:w="4552"/>
             <w:tcMar>
               <w:top w:type="dxa" w:w="0"/>
               <w:left w:type="dxa" w:w="0"/>
@@ -2714,107 +2226,69 @@
             <w:r>
               <w:rPr>
                 <w:rFonts w:ascii="Calibri" w:cs="Calibri" w:eastAsia="Calibri" w:hAnsi="Calibri"/>
+                <w:b w:val="false"/>
+                <w:bCs w:val="false"/>
+                <w:color w:val="4F545A"/>
+                <w:sz w:val="30"/>
+                <w:szCs w:val="30"/>
+              </w:rPr>
+              <w:t xml:space="preserve"/>
+            </w:r>
+          </w:p>
+          <w:p>
+            <w:pPr>
+              <w:pBdr>
+                <w:top w:val="single" w:color="D9D3C9" w:sz="6"/>
+              </w:pBdr>
+              <w:spacing w:after="45" w:before="55"/>
+            </w:pPr>
+            <w:r>
+              <w:rPr>
+                <w:rFonts w:ascii="Calibri" w:cs="Calibri" w:eastAsia="Calibri" w:hAnsi="Calibri"/>
+                <w:b w:val="false"/>
+                <w:bCs w:val="false"/>
+                <w:color w:val="4F545A"/>
+                <w:sz w:val="6"/>
+                <w:szCs w:val="6"/>
+              </w:rPr>
+              <w:t xml:space="preserve"/>
+            </w:r>
+          </w:p>
+          <w:p>
+            <w:pPr>
+              <w:spacing w:after="0" w:before="0"/>
+            </w:pPr>
+            <w:r>
+              <w:rPr>
+                <w:rFonts w:ascii="Calibri" w:cs="Calibri" w:eastAsia="Calibri" w:hAnsi="Calibri"/>
                 <w:b/>
                 <w:bCs/>
-                <w:i w:val="false"/>
-                <w:iCs w:val="false"/>
-                <w:color w:val="7C818A"/>
-                <w:spacing w:val="80"/>
+                <w:color w:val="23272B"/>
+                <w:spacing w:val="60"/>
+                <w:sz w:val="12"/>
+                <w:szCs w:val="12"/>
+              </w:rPr>
+              <w:t xml:space="preserve">ACEPTACIÓN DEL CLIENTE</w:t>
+            </w:r>
+            <w:r>
+              <w:rPr>
+                <w:rFonts w:ascii="Calibri" w:cs="Calibri" w:eastAsia="Calibri" w:hAnsi="Calibri"/>
+                <w:b w:val="false"/>
+                <w:bCs w:val="false"/>
+                <w:color w:val="767369"/>
                 <w:sz w:val="13"/>
                 <w:szCs w:val="13"/>
               </w:rPr>
-              <w:t xml:space="preserve">ACEPTACIÓN DEL CLIENTE</w:t>
-            </w:r>
-          </w:p>
-          <w:p>
-            <w:pPr>
-              <w:spacing w:after="0" w:before="0"/>
-            </w:pPr>
-            <w:r>
-              <w:rPr>
-                <w:rFonts w:ascii="Calibri" w:cs="Calibri" w:eastAsia="Calibri" w:hAnsi="Calibri"/>
-                <w:b w:val="false"/>
-                <w:bCs w:val="false"/>
-                <w:i w:val="false"/>
-                <w:iCs w:val="false"/>
-                <w:color w:val="42464B"/>
-                <w:sz w:val="34"/>
-                <w:szCs w:val="34"/>
-              </w:rPr>
-              <w:t xml:space="preserve"/>
-            </w:r>
-          </w:p>
-          <w:p>
-            <w:pPr>
-              <w:spacing w:after="0" w:before="0"/>
-            </w:pPr>
-            <w:r>
-              <w:rPr>
-                <w:rFonts w:ascii="Calibri" w:cs="Calibri" w:eastAsia="Calibri" w:hAnsi="Calibri"/>
-                <w:b w:val="false"/>
-                <w:bCs w:val="false"/>
-                <w:i w:val="false"/>
-                <w:iCs w:val="false"/>
-                <w:color w:val="42464B"/>
-                <w:sz w:val="34"/>
-                <w:szCs w:val="34"/>
-              </w:rPr>
-              <w:t xml:space="preserve"/>
-            </w:r>
-          </w:p>
-          <w:p>
-            <w:pPr>
-              <w:spacing w:after="0" w:before="0"/>
-            </w:pPr>
-            <w:r>
-              <w:rPr>
-                <w:rFonts w:ascii="Calibri" w:cs="Calibri" w:eastAsia="Calibri" w:hAnsi="Calibri"/>
-                <w:b w:val="false"/>
-                <w:bCs w:val="false"/>
-                <w:i w:val="false"/>
-                <w:iCs w:val="false"/>
-                <w:color w:val="42464B"/>
-                <w:sz w:val="34"/>
-                <w:szCs w:val="34"/>
-              </w:rPr>
-              <w:t xml:space="preserve"/>
-            </w:r>
-          </w:p>
-          <w:p>
-            <w:pPr>
-              <w:pBdr>
-                <w:top w:val="single" w:color="D6D3CE" w:sz="6"/>
-              </w:pBdr>
-              <w:spacing w:after="60" w:before="80"/>
-            </w:pPr>
-            <w:r>
-              <w:rPr>
-                <w:rFonts w:ascii="Calibri" w:cs="Calibri" w:eastAsia="Calibri" w:hAnsi="Calibri"/>
-                <w:b w:val="false"/>
-                <w:bCs w:val="false"/>
-                <w:i w:val="false"/>
-                <w:iCs w:val="false"/>
-                <w:color w:val="42464B"/>
-                <w:sz w:val="6"/>
-                <w:szCs w:val="6"/>
-              </w:rPr>
-              <w:t xml:space="preserve"/>
-            </w:r>
-          </w:p>
-          <w:p>
-            <w:pPr>
-              <w:spacing w:after="0" w:before="0"/>
-            </w:pPr>
-            <w:r>
-              <w:rPr>
-                <w:rFonts w:ascii="Calibri" w:cs="Calibri" w:eastAsia="Calibri" w:hAnsi="Calibri"/>
-                <w:b w:val="false"/>
-                <w:bCs w:val="false"/>
-                <w:i w:val="false"/>
-                <w:iCs w:val="false"/>
-                <w:color w:val="7C818A"/>
-                <w:sz w:val="16"/>
-                <w:szCs w:val="16"/>
+              <w:t xml:space="preserve">   ·   </w:t>
+            </w:r>
+            <w:r>
+              <w:rPr>
+                <w:rFonts w:ascii="Calibri" w:cs="Calibri" w:eastAsia="Calibri" w:hAnsi="Calibri"/>
+                <w:b w:val="false"/>
+                <w:bCs w:val="false"/>
+                <w:color w:val="767369"/>
+                <w:sz w:val="14"/>
+                <w:szCs w:val="14"/>
               </w:rPr>
               <w:t xml:space="preserve">Nombre, firma y fecha</w:t>
             </w:r>
@@ -2828,7 +2302,7 @@
       <w:footerReference w:type="default" r:id="rId9"/>
       <w:footerReference w:type="first" r:id="rId10"/>
       <w:pgSz w:w="12240" w:h="15840" w:orient="portrait"/>
-      <w:pgMar w:top="1152" w:right="1584" w:bottom="1728" w:left="1584" w:header="576" w:footer="504" w:gutter="0"/>
+      <w:pgMar w:top="900" w:right="1368" w:bottom="1330" w:left="1368" w:header="480" w:footer="420" w:gutter="0"/>
       <w:pgNumType/>
       <w:titlePg/>
       <w:docGrid w:linePitch="360"/>
@@ -2882,7 +2356,7 @@
 <w:ftr xmlns:wpc="http://schemas.microsoft.com/office/word/2010/wordprocessingCanvas" xmlns:mc="http://schemas.openxmlformats.org/markup-compatibility/2006" xmlns:o="urn:schemas-microsoft-com:office:office" xmlns:r="http://schemas.openxmlformats.org/officeDocument/2006/relationships" xmlns:m="http://schemas.openxmlformats.org/officeDocument/2006/math" xmlns:v="urn:schemas-microsoft-com:vml" xmlns:wp14="http://schemas.microsoft.com/office/word/2010/wordprocessingDrawing" xmlns:wp="http://schemas.openxmlformats.org/drawingml/2006/wordprocessingDrawing" xmlns:w10="urn:schemas-microsoft-com:office:word" xmlns:w="http://schemas.openxmlformats.org/wordprocessingml/2006/main" xmlns:w14="http://schemas.microsoft.com/office/word/2010/wordml" xmlns:w15="http://schemas.microsoft.com/office/word/2012/wordml" xmlns:wpg="http://schemas.microsoft.com/office/word/2010/wordprocessingGroup" xmlns:wpi="http://schemas.microsoft.com/office/word/2010/wordprocessingInk" xmlns:wne="http://schemas.microsoft.com/office/word/2006/wordml" xmlns:wps="http://schemas.microsoft.com/office/word/2010/wordprocessingShape">
   <w:tbl>
     <w:tblPr>
-      <w:tblW w:type="dxa" w:w="9072"/>
+      <w:tblW w:type="dxa" w:w="9504"/>
       <w:tblBorders>
         <w:top w:val="none"/>
         <w:left w:val="none"/>
@@ -2894,17 +2368,17 @@
       <w:tblLayout w:type="fixed"/>
     </w:tblPr>
     <w:tblGrid>
-      <w:gridCol w:w="1240"/>
-      <w:gridCol w:w="7832"/>
+      <w:gridCol w:w="1160"/>
+      <w:gridCol w:w="8344"/>
     </w:tblGrid>
     <w:tr>
       <w:tc>
         <w:tcPr>
-          <w:tcW w:type="dxa" w:w="1240"/>
+          <w:tcW w:type="dxa" w:w="1160"/>
           <w:tcBorders>
             <w:top w:val="none"/>
             <w:left w:val="none"/>
-            <w:bottom w:val="single" w:color="C21112" w:sz="12"/>
+            <w:bottom w:val="single" w:color="8A3B33" w:sz="10"/>
             <w:right w:val="none"/>
           </w:tcBorders>
           <w:tcMar>
@@ -2923,9 +2397,7 @@
               <w:rFonts w:ascii="Calibri" w:cs="Calibri" w:eastAsia="Calibri" w:hAnsi="Calibri"/>
               <w:b w:val="false"/>
               <w:bCs w:val="false"/>
-              <w:i w:val="false"/>
-              <w:iCs w:val="false"/>
-              <w:color w:val="42464B"/>
+              <w:color w:val="4F545A"/>
               <w:sz w:val="1"/>
               <w:szCs w:val="1"/>
             </w:rPr>
@@ -2935,11 +2407,11 @@
       </w:tc>
       <w:tc>
         <w:tcPr>
-          <w:tcW w:type="dxa" w:w="7832"/>
+          <w:tcW w:type="dxa" w:w="8344"/>
           <w:tcBorders>
             <w:top w:val="none"/>
             <w:left w:val="none"/>
-            <w:bottom w:val="single" w:color="D6D3CE" w:sz="4"/>
+            <w:bottom w:val="single" w:color="D9D3C9" w:sz="4"/>
             <w:right w:val="none"/>
           </w:tcBorders>
           <w:tcMar>
@@ -2958,9 +2430,7 @@
               <w:rFonts w:ascii="Calibri" w:cs="Calibri" w:eastAsia="Calibri" w:hAnsi="Calibri"/>
               <w:b w:val="false"/>
               <w:bCs w:val="false"/>
-              <w:i w:val="false"/>
-              <w:iCs w:val="false"/>
-              <w:color w:val="42464B"/>
+              <w:color w:val="4F545A"/>
               <w:sz w:val="1"/>
               <w:szCs w:val="1"/>
             </w:rPr>
@@ -2979,9 +2449,7 @@
         <w:rFonts w:ascii="Calibri" w:cs="Calibri" w:eastAsia="Calibri" w:hAnsi="Calibri"/>
         <w:b w:val="false"/>
         <w:bCs w:val="false"/>
-        <w:i w:val="false"/>
-        <w:iCs w:val="false"/>
-        <w:color w:val="42464B"/>
+        <w:color w:val="4F545A"/>
         <w:sz w:val="6"/>
         <w:szCs w:val="6"/>
       </w:rPr>
@@ -2990,7 +2458,7 @@
   </w:p>
   <w:tbl>
     <w:tblPr>
-      <w:tblW w:type="dxa" w:w="9072"/>
+      <w:tblW w:type="dxa" w:w="9504"/>
       <w:tblBorders>
         <w:top w:val="none"/>
         <w:left w:val="none"/>
@@ -3002,14 +2470,14 @@
       <w:tblLayout w:type="fixed"/>
     </w:tblPr>
     <w:tblGrid>
-      <w:gridCol w:w="3300"/>
-      <w:gridCol w:w="3300"/>
-      <w:gridCol w:w="2472"/>
+      <w:gridCol w:w="3500"/>
+      <w:gridCol w:w="3500"/>
+      <w:gridCol w:w="2504"/>
     </w:tblGrid>
     <w:tr>
       <w:tc>
         <w:tcPr>
-          <w:tcW w:type="dxa" w:w="3300"/>
+          <w:tcW w:type="dxa" w:w="3500"/>
           <w:tcMar>
             <w:top w:type="dxa" w:w="0"/>
             <w:left w:type="dxa" w:w="0"/>
@@ -3019,81 +2487,57 @@
         </w:tcPr>
         <w:p>
           <w:pPr>
-            <w:spacing w:after="50" w:before="0"/>
+            <w:spacing w:after="45" w:before="0"/>
           </w:pPr>
           <w:r>
             <w:rPr>
               <w:rFonts w:ascii="Calibri" w:cs="Calibri" w:eastAsia="Calibri" w:hAnsi="Calibri"/>
               <w:b/>
               <w:bCs/>
-              <w:i w:val="false"/>
-              <w:iCs w:val="false"/>
-              <w:color w:val="C21112"/>
+              <w:color w:val="8A3B33"/>
               <w:spacing w:val="80"/>
-              <w:sz w:val="12"/>
-              <w:szCs w:val="12"/>
+              <w:sz w:val="11"/>
+              <w:szCs w:val="11"/>
             </w:rPr>
             <w:t xml:space="preserve">MATRIZ</w:t>
           </w:r>
         </w:p>
         <w:p>
           <w:pPr>
-            <w:spacing w:after="0" w:before="0" w:line="220" w:lineRule="auto"/>
+            <w:spacing w:after="0" w:before="0" w:line="215" w:lineRule="auto"/>
           </w:pPr>
           <w:r>
             <w:rPr>
               <w:rFonts w:ascii="Calibri" w:cs="Calibri" w:eastAsia="Calibri" w:hAnsi="Calibri"/>
               <w:b w:val="false"/>
               <w:bCs w:val="false"/>
-              <w:i w:val="false"/>
-              <w:iCs w:val="false"/>
-              <w:color w:val="7C818A"/>
-              <w:sz w:val="14"/>
-              <w:szCs w:val="14"/>
+              <w:color w:val="767369"/>
+              <w:sz w:val="13"/>
+              <w:szCs w:val="13"/>
             </w:rPr>
-            <w:t xml:space="preserve">Carretera a Laredo Km. 16.5 No. 16501</w:t>
+            <w:t xml:space="preserve">Carretera a Laredo Km. 16.5 No. 16501, Col. Moisés Sáenz</w:t>
           </w:r>
         </w:p>
         <w:p>
           <w:pPr>
-            <w:spacing w:after="0" w:before="0" w:line="220" w:lineRule="auto"/>
+            <w:spacing w:after="0" w:before="0" w:line="215" w:lineRule="auto"/>
           </w:pPr>
           <w:r>
             <w:rPr>
               <w:rFonts w:ascii="Calibri" w:cs="Calibri" w:eastAsia="Calibri" w:hAnsi="Calibri"/>
               <w:b w:val="false"/>
               <w:bCs w:val="false"/>
-              <w:i w:val="false"/>
-              <w:iCs w:val="false"/>
-              <w:color w:val="7C818A"/>
-              <w:sz w:val="14"/>
-              <w:szCs w:val="14"/>
+              <w:color w:val="767369"/>
+              <w:sz w:val="13"/>
+              <w:szCs w:val="13"/>
             </w:rPr>
-            <w:t xml:space="preserve">Col. Moisés Sáenz, Apodaca, N.L., C.P. 66613</w:t>
-          </w:r>
-        </w:p>
-        <w:p>
-          <w:pPr>
-            <w:spacing w:after="0" w:before="0" w:line="220" w:lineRule="auto"/>
-          </w:pPr>
-          <w:r>
-            <w:rPr>
-              <w:rFonts w:ascii="Calibri" w:cs="Calibri" w:eastAsia="Calibri" w:hAnsi="Calibri"/>
-              <w:b w:val="false"/>
-              <w:bCs w:val="false"/>
-              <w:i w:val="false"/>
-              <w:iCs w:val="false"/>
-              <w:color w:val="7C818A"/>
-              <w:sz w:val="14"/>
-              <w:szCs w:val="14"/>
-            </w:rPr>
-            <w:t xml:space="preserve">Tel. (81) 1958-0740</w:t>
+            <w:t xml:space="preserve">Apodaca, N.L., C.P. 66613  ·  Tel. (81) 1958-0740</w:t>
           </w:r>
         </w:p>
       </w:tc>
       <w:tc>
         <w:tcPr>
-          <w:tcW w:type="dxa" w:w="3300"/>
+          <w:tcW w:type="dxa" w:w="3500"/>
           <w:tcMar>
             <w:top w:type="dxa" w:w="0"/>
             <w:left w:type="dxa" w:w="0"/>
@@ -3103,81 +2547,57 @@
         </w:tcPr>
         <w:p>
           <w:pPr>
-            <w:spacing w:after="50" w:before="0"/>
+            <w:spacing w:after="45" w:before="0"/>
           </w:pPr>
           <w:r>
             <w:rPr>
               <w:rFonts w:ascii="Calibri" w:cs="Calibri" w:eastAsia="Calibri" w:hAnsi="Calibri"/>
               <w:b/>
               <w:bCs/>
-              <w:i w:val="false"/>
-              <w:iCs w:val="false"/>
-              <w:color w:val="C21112"/>
+              <w:color w:val="8A3B33"/>
               <w:spacing w:val="80"/>
-              <w:sz w:val="12"/>
-              <w:szCs w:val="12"/>
+              <w:sz w:val="11"/>
+              <w:szCs w:val="11"/>
             </w:rPr>
             <w:t xml:space="preserve">CIUDAD DE MÉXICO</w:t>
           </w:r>
         </w:p>
         <w:p>
           <w:pPr>
-            <w:spacing w:after="0" w:before="0" w:line="220" w:lineRule="auto"/>
+            <w:spacing w:after="0" w:before="0" w:line="215" w:lineRule="auto"/>
           </w:pPr>
           <w:r>
             <w:rPr>
               <w:rFonts w:ascii="Calibri" w:cs="Calibri" w:eastAsia="Calibri" w:hAnsi="Calibri"/>
               <w:b w:val="false"/>
               <w:bCs w:val="false"/>
-              <w:i w:val="false"/>
-              <w:iCs w:val="false"/>
-              <w:color w:val="7C818A"/>
-              <w:sz w:val="14"/>
-              <w:szCs w:val="14"/>
+              <w:color w:val="767369"/>
+              <w:sz w:val="13"/>
+              <w:szCs w:val="13"/>
             </w:rPr>
-            <w:t xml:space="preserve">Álamo No. 28 / Av. Ceylán Esq. Encino</w:t>
+            <w:t xml:space="preserve">Álamo No. 28 / Av. Ceylán Esq. Encino, Col. Tabla Honda</w:t>
           </w:r>
         </w:p>
         <w:p>
           <w:pPr>
-            <w:spacing w:after="0" w:before="0" w:line="220" w:lineRule="auto"/>
+            <w:spacing w:after="0" w:before="0" w:line="215" w:lineRule="auto"/>
           </w:pPr>
           <w:r>
             <w:rPr>
               <w:rFonts w:ascii="Calibri" w:cs="Calibri" w:eastAsia="Calibri" w:hAnsi="Calibri"/>
               <w:b w:val="false"/>
               <w:bCs w:val="false"/>
-              <w:i w:val="false"/>
-              <w:iCs w:val="false"/>
-              <w:color w:val="7C818A"/>
-              <w:sz w:val="14"/>
-              <w:szCs w:val="14"/>
+              <w:color w:val="767369"/>
+              <w:sz w:val="13"/>
+              <w:szCs w:val="13"/>
             </w:rPr>
-            <w:t xml:space="preserve">Col. Tabla Honda, Tlalnepantla, Edo. de México</w:t>
-          </w:r>
-        </w:p>
-        <w:p>
-          <w:pPr>
-            <w:spacing w:after="0" w:before="0" w:line="220" w:lineRule="auto"/>
-          </w:pPr>
-          <w:r>
-            <w:rPr>
-              <w:rFonts w:ascii="Calibri" w:cs="Calibri" w:eastAsia="Calibri" w:hAnsi="Calibri"/>
-              <w:b w:val="false"/>
-              <w:bCs w:val="false"/>
-              <w:i w:val="false"/>
-              <w:iCs w:val="false"/>
-              <w:color w:val="7C818A"/>
-              <w:sz w:val="14"/>
-              <w:szCs w:val="14"/>
-            </w:rPr>
-            <w:t xml:space="preserve">Tel. (55) 5308-7500</w:t>
+            <w:t xml:space="preserve">Tlalnepantla, Edo. de México  ·  Tel. (55) 5308-7500</w:t>
           </w:r>
         </w:p>
       </w:tc>
       <w:tc>
         <w:tcPr>
-          <w:tcW w:type="dxa" w:w="2472"/>
+          <w:tcW w:type="dxa" w:w="2504"/>
           <w:tcMar>
             <w:top w:type="dxa" w:w="0"/>
             <w:left w:type="dxa" w:w="0"/>
@@ -3187,7 +2607,7 @@
         </w:tcPr>
         <w:p>
           <w:pPr>
-            <w:spacing w:after="60" w:before="0"/>
+            <w:spacing w:after="45" w:before="0"/>
             <w:jc w:val="right"/>
           </w:pPr>
           <w:r>
@@ -3195,13 +2615,12 @@
               <w:rFonts w:ascii="Calibri" w:cs="Calibri" w:eastAsia="Calibri" w:hAnsi="Calibri"/>
               <w:b/>
               <w:bCs/>
-              <w:i w:val="false"/>
-              <w:iCs w:val="false"/>
-              <w:color w:val="C21112"/>
-              <w:sz w:val="15"/>
-              <w:szCs w:val="15"/>
+              <w:color w:val="767369"/>
+              <w:spacing w:val="80"/>
+              <w:sz w:val="11"/>
+              <w:szCs w:val="11"/>
             </w:rPr>
-            <w:t xml:space="preserve">www.grupotauro.com.mx</w:t>
+            <w:t xml:space="preserve">SITIO</w:t>
           </w:r>
         </w:p>
         <w:p>
@@ -3212,52 +2631,13 @@
           <w:r>
             <w:rPr>
               <w:rFonts w:ascii="Calibri" w:cs="Calibri" w:eastAsia="Calibri" w:hAnsi="Calibri"/>
-              <w:b w:val="false"/>
-              <w:bCs w:val="false"/>
-              <w:i w:val="false"/>
-              <w:iCs w:val="false"/>
-              <w:color w:val="7C818A"/>
-              <w:sz w:val="13"/>
-              <w:szCs w:val="13"/>
+              <w:b/>
+              <w:bCs/>
+              <w:color w:val="8A3B33"/>
+              <w:sz w:val="14"/>
+              <w:szCs w:val="14"/>
             </w:rPr>
-            <w:t xml:space="preserve">Página </w:t>
-          </w:r>
-          <w:r>
-            <w:rPr>
-              <w:rFonts w:ascii="Calibri" w:cs="Calibri" w:eastAsia="Calibri" w:hAnsi="Calibri"/>
-              <w:color w:val="7C818A"/>
-              <w:sz w:val="13"/>
-              <w:szCs w:val="13"/>
-            </w:rPr>
-            <w:fldChar w:fldCharType="begin"/>
-            <w:instrText xml:space="preserve">PAGE</w:instrText>
-            <w:fldChar w:fldCharType="separate"/>
-            <w:fldChar w:fldCharType="end"/>
-          </w:r>
-          <w:r>
-            <w:rPr>
-              <w:rFonts w:ascii="Calibri" w:cs="Calibri" w:eastAsia="Calibri" w:hAnsi="Calibri"/>
-              <w:b w:val="false"/>
-              <w:bCs w:val="false"/>
-              <w:i w:val="false"/>
-              <w:iCs w:val="false"/>
-              <w:color w:val="7C818A"/>
-              <w:sz w:val="13"/>
-              <w:szCs w:val="13"/>
-            </w:rPr>
-            <w:t xml:space="preserve"> de </w:t>
-          </w:r>
-          <w:r>
-            <w:rPr>
-              <w:rFonts w:ascii="Calibri" w:cs="Calibri" w:eastAsia="Calibri" w:hAnsi="Calibri"/>
-              <w:color w:val="7C818A"/>
-              <w:sz w:val="13"/>
-              <w:szCs w:val="13"/>
-            </w:rPr>
-            <w:fldChar w:fldCharType="begin"/>
-            <w:instrText xml:space="preserve">NUMPAGES</w:instrText>
-            <w:fldChar w:fldCharType="separate"/>
-            <w:fldChar w:fldCharType="end"/>
+            <w:t xml:space="preserve">www.grupotauro.com.mx</w:t>
           </w:r>
         </w:p>
       </w:tc>
@@ -3270,7 +2650,7 @@
 <w:ftr xmlns:wpc="http://schemas.microsoft.com/office/word/2010/wordprocessingCanvas" xmlns:mc="http://schemas.openxmlformats.org/markup-compatibility/2006" xmlns:o="urn:schemas-microsoft-com:office:office" xmlns:r="http://schemas.openxmlformats.org/officeDocument/2006/relationships" xmlns:m="http://schemas.openxmlformats.org/officeDocument/2006/math" xmlns:v="urn:schemas-microsoft-com:vml" xmlns:wp14="http://schemas.microsoft.com/office/word/2010/wordprocessingDrawing" xmlns:wp="http://schemas.openxmlformats.org/drawingml/2006/wordprocessingDrawing" xmlns:w10="urn:schemas-microsoft-com:office:word" xmlns:w="http://schemas.openxmlformats.org/wordprocessingml/2006/main" xmlns:w14="http://schemas.microsoft.com/office/word/2010/wordml" xmlns:w15="http://schemas.microsoft.com/office/word/2012/wordml" xmlns:wpg="http://schemas.microsoft.com/office/word/2010/wordprocessingGroup" xmlns:wpi="http://schemas.microsoft.com/office/word/2010/wordprocessingInk" xmlns:wne="http://schemas.microsoft.com/office/word/2006/wordml" xmlns:wps="http://schemas.microsoft.com/office/word/2010/wordprocessingShape">
   <w:tbl>
     <w:tblPr>
-      <w:tblW w:type="dxa" w:w="9072"/>
+      <w:tblW w:type="dxa" w:w="9504"/>
       <w:tblBorders>
         <w:top w:val="none"/>
         <w:left w:val="none"/>
@@ -3282,17 +2662,17 @@
       <w:tblLayout w:type="fixed"/>
     </w:tblPr>
     <w:tblGrid>
-      <w:gridCol w:w="1240"/>
-      <w:gridCol w:w="7832"/>
+      <w:gridCol w:w="1160"/>
+      <w:gridCol w:w="8344"/>
     </w:tblGrid>
     <w:tr>
       <w:tc>
         <w:tcPr>
-          <w:tcW w:type="dxa" w:w="1240"/>
+          <w:tcW w:type="dxa" w:w="1160"/>
           <w:tcBorders>
             <w:top w:val="none"/>
             <w:left w:val="none"/>
-            <w:bottom w:val="single" w:color="C21112" w:sz="12"/>
+            <w:bottom w:val="single" w:color="8A3B33" w:sz="10"/>
             <w:right w:val="none"/>
           </w:tcBorders>
           <w:tcMar>
@@ -3311,9 +2691,7 @@
               <w:rFonts w:ascii="Calibri" w:cs="Calibri" w:eastAsia="Calibri" w:hAnsi="Calibri"/>
               <w:b w:val="false"/>
               <w:bCs w:val="false"/>
-              <w:i w:val="false"/>
-              <w:iCs w:val="false"/>
-              <w:color w:val="42464B"/>
+              <w:color w:val="4F545A"/>
               <w:sz w:val="1"/>
               <w:szCs w:val="1"/>
             </w:rPr>
@@ -3323,11 +2701,11 @@
       </w:tc>
       <w:tc>
         <w:tcPr>
-          <w:tcW w:type="dxa" w:w="7832"/>
+          <w:tcW w:type="dxa" w:w="8344"/>
           <w:tcBorders>
             <w:top w:val="none"/>
             <w:left w:val="none"/>
-            <w:bottom w:val="single" w:color="D6D3CE" w:sz="4"/>
+            <w:bottom w:val="single" w:color="D9D3C9" w:sz="4"/>
             <w:right w:val="none"/>
           </w:tcBorders>
           <w:tcMar>
@@ -3346,9 +2724,7 @@
               <w:rFonts w:ascii="Calibri" w:cs="Calibri" w:eastAsia="Calibri" w:hAnsi="Calibri"/>
               <w:b w:val="false"/>
               <w:bCs w:val="false"/>
-              <w:i w:val="false"/>
-              <w:iCs w:val="false"/>
-              <w:color w:val="42464B"/>
+              <w:color w:val="4F545A"/>
               <w:sz w:val="1"/>
               <w:szCs w:val="1"/>
             </w:rPr>
@@ -3367,9 +2743,7 @@
         <w:rFonts w:ascii="Calibri" w:cs="Calibri" w:eastAsia="Calibri" w:hAnsi="Calibri"/>
         <w:b w:val="false"/>
         <w:bCs w:val="false"/>
-        <w:i w:val="false"/>
-        <w:iCs w:val="false"/>
-        <w:color w:val="42464B"/>
+        <w:color w:val="4F545A"/>
         <w:sz w:val="6"/>
         <w:szCs w:val="6"/>
       </w:rPr>
@@ -3378,7 +2752,7 @@
   </w:p>
   <w:tbl>
     <w:tblPr>
-      <w:tblW w:type="dxa" w:w="9072"/>
+      <w:tblW w:type="dxa" w:w="9504"/>
       <w:tblBorders>
         <w:top w:val="none"/>
         <w:left w:val="none"/>
@@ -3390,14 +2764,14 @@
       <w:tblLayout w:type="fixed"/>
     </w:tblPr>
     <w:tblGrid>
-      <w:gridCol w:w="3300"/>
-      <w:gridCol w:w="3300"/>
-      <w:gridCol w:w="2472"/>
+      <w:gridCol w:w="3500"/>
+      <w:gridCol w:w="3500"/>
+      <w:gridCol w:w="2504"/>
     </w:tblGrid>
     <w:tr>
       <w:tc>
         <w:tcPr>
-          <w:tcW w:type="dxa" w:w="3300"/>
+          <w:tcW w:type="dxa" w:w="3500"/>
           <w:tcMar>
             <w:top w:type="dxa" w:w="0"/>
             <w:left w:type="dxa" w:w="0"/>
@@ -3407,81 +2781,57 @@
         </w:tcPr>
         <w:p>
           <w:pPr>
-            <w:spacing w:after="50" w:before="0"/>
+            <w:spacing w:after="45" w:before="0"/>
           </w:pPr>
           <w:r>
             <w:rPr>
               <w:rFonts w:ascii="Calibri" w:cs="Calibri" w:eastAsia="Calibri" w:hAnsi="Calibri"/>
               <w:b/>
               <w:bCs/>
-              <w:i w:val="false"/>
-              <w:iCs w:val="false"/>
-              <w:color w:val="C21112"/>
+              <w:color w:val="8A3B33"/>
               <w:spacing w:val="80"/>
-              <w:sz w:val="12"/>
-              <w:szCs w:val="12"/>
+              <w:sz w:val="11"/>
+              <w:szCs w:val="11"/>
             </w:rPr>
             <w:t xml:space="preserve">MATRIZ</w:t>
           </w:r>
         </w:p>
         <w:p>
           <w:pPr>
-            <w:spacing w:after="0" w:before="0" w:line="220" w:lineRule="auto"/>
+            <w:spacing w:after="0" w:before="0" w:line="215" w:lineRule="auto"/>
           </w:pPr>
           <w:r>
             <w:rPr>
               <w:rFonts w:ascii="Calibri" w:cs="Calibri" w:eastAsia="Calibri" w:hAnsi="Calibri"/>
               <w:b w:val="false"/>
               <w:bCs w:val="false"/>
-              <w:i w:val="false"/>
-              <w:iCs w:val="false"/>
-              <w:color w:val="7C818A"/>
-              <w:sz w:val="14"/>
-              <w:szCs w:val="14"/>
+              <w:color w:val="767369"/>
+              <w:sz w:val="13"/>
+              <w:szCs w:val="13"/>
             </w:rPr>
-            <w:t xml:space="preserve">Carretera a Laredo Km. 16.5 No. 16501</w:t>
+            <w:t xml:space="preserve">Carretera a Laredo Km. 16.5 No. 16501, Col. Moisés Sáenz</w:t>
           </w:r>
         </w:p>
         <w:p>
           <w:pPr>
-            <w:spacing w:after="0" w:before="0" w:line="220" w:lineRule="auto"/>
+            <w:spacing w:after="0" w:before="0" w:line="215" w:lineRule="auto"/>
           </w:pPr>
           <w:r>
             <w:rPr>
               <w:rFonts w:ascii="Calibri" w:cs="Calibri" w:eastAsia="Calibri" w:hAnsi="Calibri"/>
               <w:b w:val="false"/>
               <w:bCs w:val="false"/>
-              <w:i w:val="false"/>
-              <w:iCs w:val="false"/>
-              <w:color w:val="7C818A"/>
-              <w:sz w:val="14"/>
-              <w:szCs w:val="14"/>
+              <w:color w:val="767369"/>
+              <w:sz w:val="13"/>
+              <w:szCs w:val="13"/>
             </w:rPr>
-            <w:t xml:space="preserve">Col. Moisés Sáenz, Apodaca, N.L., C.P. 66613</w:t>
-          </w:r>
-        </w:p>
-        <w:p>
-          <w:pPr>
-            <w:spacing w:after="0" w:before="0" w:line="220" w:lineRule="auto"/>
-          </w:pPr>
-          <w:r>
-            <w:rPr>
-              <w:rFonts w:ascii="Calibri" w:cs="Calibri" w:eastAsia="Calibri" w:hAnsi="Calibri"/>
-              <w:b w:val="false"/>
-              <w:bCs w:val="false"/>
-              <w:i w:val="false"/>
-              <w:iCs w:val="false"/>
-              <w:color w:val="7C818A"/>
-              <w:sz w:val="14"/>
-              <w:szCs w:val="14"/>
-            </w:rPr>
-            <w:t xml:space="preserve">Tel. (81) 1958-0740</w:t>
+            <w:t xml:space="preserve">Apodaca, N.L., C.P. 66613  ·  Tel. (81) 1958-0740</w:t>
           </w:r>
         </w:p>
       </w:tc>
       <w:tc>
         <w:tcPr>
-          <w:tcW w:type="dxa" w:w="3300"/>
+          <w:tcW w:type="dxa" w:w="3500"/>
           <w:tcMar>
             <w:top w:type="dxa" w:w="0"/>
             <w:left w:type="dxa" w:w="0"/>
@@ -3491,81 +2841,57 @@
         </w:tcPr>
         <w:p>
           <w:pPr>
-            <w:spacing w:after="50" w:before="0"/>
+            <w:spacing w:after="45" w:before="0"/>
           </w:pPr>
           <w:r>
             <w:rPr>
               <w:rFonts w:ascii="Calibri" w:cs="Calibri" w:eastAsia="Calibri" w:hAnsi="Calibri"/>
               <w:b/>
               <w:bCs/>
-              <w:i w:val="false"/>
-              <w:iCs w:val="false"/>
-              <w:color w:val="C21112"/>
+              <w:color w:val="8A3B33"/>
               <w:spacing w:val="80"/>
-              <w:sz w:val="12"/>
-              <w:szCs w:val="12"/>
+              <w:sz w:val="11"/>
+              <w:szCs w:val="11"/>
             </w:rPr>
             <w:t xml:space="preserve">CIUDAD DE MÉXICO</w:t>
           </w:r>
         </w:p>
         <w:p>
           <w:pPr>
-            <w:spacing w:after="0" w:before="0" w:line="220" w:lineRule="auto"/>
+            <w:spacing w:after="0" w:before="0" w:line="215" w:lineRule="auto"/>
           </w:pPr>
           <w:r>
             <w:rPr>
               <w:rFonts w:ascii="Calibri" w:cs="Calibri" w:eastAsia="Calibri" w:hAnsi="Calibri"/>
               <w:b w:val="false"/>
               <w:bCs w:val="false"/>
-              <w:i w:val="false"/>
-              <w:iCs w:val="false"/>
-              <w:color w:val="7C818A"/>
-              <w:sz w:val="14"/>
-              <w:szCs w:val="14"/>
+              <w:color w:val="767369"/>
+              <w:sz w:val="13"/>
+              <w:szCs w:val="13"/>
             </w:rPr>
-            <w:t xml:space="preserve">Álamo No. 28 / Av. Ceylán Esq. Encino</w:t>
+            <w:t xml:space="preserve">Álamo No. 28 / Av. Ceylán Esq. Encino, Col. Tabla Honda</w:t>
           </w:r>
         </w:p>
         <w:p>
           <w:pPr>
-            <w:spacing w:after="0" w:before="0" w:line="220" w:lineRule="auto"/>
+            <w:spacing w:after="0" w:before="0" w:line="215" w:lineRule="auto"/>
           </w:pPr>
           <w:r>
             <w:rPr>
               <w:rFonts w:ascii="Calibri" w:cs="Calibri" w:eastAsia="Calibri" w:hAnsi="Calibri"/>
               <w:b w:val="false"/>
               <w:bCs w:val="false"/>
-              <w:i w:val="false"/>
-              <w:iCs w:val="false"/>
-              <w:color w:val="7C818A"/>
-              <w:sz w:val="14"/>
-              <w:szCs w:val="14"/>
+              <w:color w:val="767369"/>
+              <w:sz w:val="13"/>
+              <w:szCs w:val="13"/>
             </w:rPr>
-            <w:t xml:space="preserve">Col. Tabla Honda, Tlalnepantla, Edo. de México</w:t>
-          </w:r>
-        </w:p>
-        <w:p>
-          <w:pPr>
-            <w:spacing w:after="0" w:before="0" w:line="220" w:lineRule="auto"/>
-          </w:pPr>
-          <w:r>
-            <w:rPr>
-              <w:rFonts w:ascii="Calibri" w:cs="Calibri" w:eastAsia="Calibri" w:hAnsi="Calibri"/>
-              <w:b w:val="false"/>
-              <w:bCs w:val="false"/>
-              <w:i w:val="false"/>
-              <w:iCs w:val="false"/>
-              <w:color w:val="7C818A"/>
-              <w:sz w:val="14"/>
-              <w:szCs w:val="14"/>
-            </w:rPr>
-            <w:t xml:space="preserve">Tel. (55) 5308-7500</w:t>
+            <w:t xml:space="preserve">Tlalnepantla, Edo. de México  ·  Tel. (55) 5308-7500</w:t>
           </w:r>
         </w:p>
       </w:tc>
       <w:tc>
         <w:tcPr>
-          <w:tcW w:type="dxa" w:w="2472"/>
+          <w:tcW w:type="dxa" w:w="2504"/>
           <w:tcMar>
             <w:top w:type="dxa" w:w="0"/>
             <w:left w:type="dxa" w:w="0"/>
@@ -3575,7 +2901,7 @@
         </w:tcPr>
         <w:p>
           <w:pPr>
-            <w:spacing w:after="60" w:before="0"/>
+            <w:spacing w:after="45" w:before="0"/>
             <w:jc w:val="right"/>
           </w:pPr>
           <w:r>
@@ -3583,13 +2909,12 @@
               <w:rFonts w:ascii="Calibri" w:cs="Calibri" w:eastAsia="Calibri" w:hAnsi="Calibri"/>
               <w:b/>
               <w:bCs/>
-              <w:i w:val="false"/>
-              <w:iCs w:val="false"/>
-              <w:color w:val="C21112"/>
-              <w:sz w:val="15"/>
-              <w:szCs w:val="15"/>
+              <w:color w:val="767369"/>
+              <w:spacing w:val="80"/>
+              <w:sz w:val="11"/>
+              <w:szCs w:val="11"/>
             </w:rPr>
-            <w:t xml:space="preserve">www.grupotauro.com.mx</w:t>
+            <w:t xml:space="preserve">SITIO</w:t>
           </w:r>
         </w:p>
         <w:p>
@@ -3600,52 +2925,13 @@
           <w:r>
             <w:rPr>
               <w:rFonts w:ascii="Calibri" w:cs="Calibri" w:eastAsia="Calibri" w:hAnsi="Calibri"/>
-              <w:b w:val="false"/>
-              <w:bCs w:val="false"/>
-              <w:i w:val="false"/>
-              <w:iCs w:val="false"/>
-              <w:color w:val="7C818A"/>
-              <w:sz w:val="13"/>
-              <w:szCs w:val="13"/>
+              <w:b/>
+              <w:bCs/>
+              <w:color w:val="8A3B33"/>
+              <w:sz w:val="14"/>
+              <w:szCs w:val="14"/>
             </w:rPr>
-            <w:t xml:space="preserve">Página </w:t>
-          </w:r>
-          <w:r>
-            <w:rPr>
-              <w:rFonts w:ascii="Calibri" w:cs="Calibri" w:eastAsia="Calibri" w:hAnsi="Calibri"/>
-              <w:color w:val="7C818A"/>
-              <w:sz w:val="13"/>
-              <w:szCs w:val="13"/>
-            </w:rPr>
-            <w:fldChar w:fldCharType="begin"/>
-            <w:instrText xml:space="preserve">PAGE</w:instrText>
-            <w:fldChar w:fldCharType="separate"/>
-            <w:fldChar w:fldCharType="end"/>
-          </w:r>
-          <w:r>
-            <w:rPr>
-              <w:rFonts w:ascii="Calibri" w:cs="Calibri" w:eastAsia="Calibri" w:hAnsi="Calibri"/>
-              <w:b w:val="false"/>
-              <w:bCs w:val="false"/>
-              <w:i w:val="false"/>
-              <w:iCs w:val="false"/>
-              <w:color w:val="7C818A"/>
-              <w:sz w:val="13"/>
-              <w:szCs w:val="13"/>
-            </w:rPr>
-            <w:t xml:space="preserve"> de </w:t>
-          </w:r>
-          <w:r>
-            <w:rPr>
-              <w:rFonts w:ascii="Calibri" w:cs="Calibri" w:eastAsia="Calibri" w:hAnsi="Calibri"/>
-              <w:color w:val="7C818A"/>
-              <w:sz w:val="13"/>
-              <w:szCs w:val="13"/>
-            </w:rPr>
-            <w:fldChar w:fldCharType="begin"/>
-            <w:instrText xml:space="preserve">NUMPAGES</w:instrText>
-            <w:fldChar w:fldCharType="separate"/>
-            <w:fldChar w:fldCharType="end"/>
+            <w:t xml:space="preserve">www.grupotauro.com.mx</w:t>
           </w:r>
         </w:p>
       </w:tc>
@@ -3695,11 +2981,11 @@
 <w:hdr xmlns:wpc="http://schemas.microsoft.com/office/word/2010/wordprocessingCanvas" xmlns:mc="http://schemas.openxmlformats.org/markup-compatibility/2006" xmlns:o="urn:schemas-microsoft-com:office:office" xmlns:r="http://schemas.openxmlformats.org/officeDocument/2006/relationships" xmlns:m="http://schemas.openxmlformats.org/officeDocument/2006/math" xmlns:v="urn:schemas-microsoft-com:vml" xmlns:wp14="http://schemas.microsoft.com/office/word/2010/wordprocessingDrawing" xmlns:wp="http://schemas.openxmlformats.org/drawingml/2006/wordprocessingDrawing" xmlns:w10="urn:schemas-microsoft-com:office:word" xmlns:w="http://schemas.openxmlformats.org/wordprocessingml/2006/main" xmlns:w14="http://schemas.microsoft.com/office/word/2010/wordml" xmlns:w15="http://schemas.microsoft.com/office/word/2012/wordml" xmlns:wpg="http://schemas.microsoft.com/office/word/2010/wordprocessingGroup" xmlns:wpi="http://schemas.microsoft.com/office/word/2010/wordprocessingInk" xmlns:wne="http://schemas.microsoft.com/office/word/2006/wordml" xmlns:wps="http://schemas.microsoft.com/office/word/2010/wordprocessingShape" xmlns:cx="http://schemas.microsoft.com/office/drawing/2014/chartex" xmlns:cx1="http://schemas.microsoft.com/office/drawing/2015/9/8/chartex" xmlns:cx2="http://schemas.microsoft.com/office/drawing/2015/10/21/chartex" xmlns:cx3="http://schemas.microsoft.com/office/drawing/2016/5/9/chartex" xmlns:cx4="http://schemas.microsoft.com/office/drawing/2016/5/10/chartex" xmlns:cx5="http://schemas.microsoft.com/office/drawing/2016/5/11/chartex" xmlns:cx6="http://schemas.microsoft.com/office/drawing/2016/5/12/chartex" xmlns:cx7="http://schemas.microsoft.com/office/drawing/2016/5/13/chartex" xmlns:cx8="http://schemas.microsoft.com/office/drawing/2016/5/14/chartex" xmlns:w16cid="http://schemas.microsoft.com/office/word/2016/wordml/cid" xmlns:w16se="http://schemas.microsoft.com/office/word/2015/wordml/symex">
   <w:tbl>
     <w:tblPr>
-      <w:tblW w:type="dxa" w:w="9072"/>
+      <w:tblW w:type="dxa" w:w="9504"/>
       <w:tblBorders>
         <w:top w:val="none"/>
         <w:left w:val="none"/>
-        <w:bottom w:val="single" w:color="D6D3CE" w:sz="4"/>
+        <w:bottom w:val="single" w:color="D9D3C9" w:sz="4"/>
         <w:right w:val="none"/>
         <w:insideH w:val="none"/>
         <w:insideV w:val="none"/>
@@ -3707,13 +2993,13 @@
       <w:tblLayout w:type="fixed"/>
     </w:tblPr>
     <w:tblGrid>
-      <w:gridCol w:w="4536"/>
-      <w:gridCol w:w="4536"/>
+      <w:gridCol w:w="4752"/>
+      <w:gridCol w:w="4752"/>
     </w:tblGrid>
     <w:tr>
       <w:tc>
         <w:tcPr>
-          <w:tcW w:type="dxa" w:w="4536"/>
+          <w:tcW w:type="dxa" w:w="4752"/>
           <w:tcMar>
             <w:top w:type="dxa" w:w="0"/>
             <w:left w:type="dxa" w:w="0"/>
@@ -3729,7 +3015,7 @@
           <w:r>
             <w:drawing>
               <wp:inline distT="0" distB="0" distL="0" distR="0">
-                <wp:extent cx="819150" cy="552450"/>
+                <wp:extent cx="781050" cy="533400"/>
                 <wp:effectExtent t="0" r="0" b="0" l="0"/>
                 <wp:docPr id="1" name="" descr="" title=""/>
                 <wp:cNvGraphicFramePr>
@@ -3754,7 +3040,7 @@
                       <pic:spPr bwMode="auto">
                         <a:xfrm>
                           <a:off x="0" y="0"/>
-                          <a:ext cx="819150" cy="552450"/>
+                          <a:ext cx="781050" cy="533400"/>
                         </a:xfrm>
                         <a:prstGeom prst="rect">
                           <a:avLst/>
@@ -3770,11 +3056,11 @@
       </w:tc>
       <w:tc>
         <w:tcPr>
-          <w:tcW w:type="dxa" w:w="4536"/>
+          <w:tcW w:type="dxa" w:w="4752"/>
           <w:tcMar>
             <w:top w:type="dxa" w:w="0"/>
             <w:left w:type="dxa" w:w="0"/>
-            <w:bottom w:type="dxa" w:w="120"/>
+            <w:bottom w:type="dxa" w:w="110"/>
             <w:right w:type="dxa" w:w="0"/>
           </w:tcMar>
           <w:vAlign w:val="bottom"/>
@@ -3789,12 +3075,10 @@
               <w:rFonts w:ascii="Calibri" w:cs="Calibri" w:eastAsia="Calibri" w:hAnsi="Calibri"/>
               <w:b/>
               <w:bCs/>
-              <w:i w:val="false"/>
-              <w:iCs w:val="false"/>
-              <w:color w:val="7C818A"/>
+              <w:color w:val="767369"/>
               <w:spacing w:val="80"/>
-              <w:sz w:val="13"/>
-              <w:szCs w:val="13"/>
+              <w:sz w:val="12"/>
+              <w:szCs w:val="12"/>
             </w:rPr>
             <w:t xml:space="preserve">COTIZACIÓN DE SERVICIO</w:t>
           </w:r>
@@ -3811,9 +3095,7 @@
         <w:rFonts w:ascii="Calibri" w:cs="Calibri" w:eastAsia="Calibri" w:hAnsi="Calibri"/>
         <w:b w:val="false"/>
         <w:bCs w:val="false"/>
-        <w:i w:val="false"/>
-        <w:iCs w:val="false"/>
-        <w:color w:val="42464B"/>
+        <w:color w:val="4F545A"/>
         <w:sz w:val="18"/>
         <w:szCs w:val="18"/>
       </w:rPr>
@@ -3834,9 +3116,7 @@
         <w:rFonts w:ascii="Calibri" w:cs="Calibri" w:eastAsia="Calibri" w:hAnsi="Calibri"/>
         <w:b w:val="false"/>
         <w:bCs w:val="false"/>
-        <w:i w:val="false"/>
-        <w:iCs w:val="false"/>
-        <w:color w:val="42464B"/>
+        <w:color w:val="4F545A"/>
         <w:sz w:val="2"/>
         <w:szCs w:val="2"/>
       </w:rPr>
@@ -3947,9 +3227,9 @@
     <w:rPrDefault>
       <w:rPr>
         <w:rFonts w:ascii="Calibri" w:cs="Calibri" w:eastAsia="Calibri" w:hAnsi="Calibri"/>
-        <w:color w:val="7C818A"/>
-        <w:sz w:val="13"/>
-        <w:szCs w:val="13"/>
+        <w:color w:val="4F545A"/>
+        <w:sz w:val="19"/>
+        <w:szCs w:val="19"/>
       </w:rPr>
     </w:rPrDefault>
     <w:pPrDefault>

</xml_diff>